<commit_message>
Remove minutagem dos roteiros
Co-Authored-By: Claude Sonnet 5.5 <noreply@anthropic.com>
Claude-Session: https://claude.ai/code/session_01A1uq3DMjJX968bUrHfUPw3
</commit_message>
<xml_diff>
--- a/roteiros-venda/Roteiros-Necessaire-Make-e-Termica-Mimo.docx
+++ b/roteiros-venda/Roteiros-Necessaire-Make-e-Termica-Mimo.docx
@@ -152,7 +152,7 @@
         <w:pStyle w:val="ListBullet"/>
       </w:pPr>
       <w:r>
-        <w:t>Duração pensada para Reels, TikTok e anúncio em vídeo vertical (9:16).</w:t>
+        <w:t>Formato pensado para Reels, TikTok e anúncio em vídeo vertical (9:16).</w:t>
       </w:r>
     </w:p>
     <w:p>
@@ -585,7 +585,7 @@
         <w:pStyle w:val="Heading2"/>
       </w:pPr>
       <w:r>
-        <w:t>Roteiro 1: "A Maria vendeu" (Reels, 40 a 50s)</w:t>
+        <w:t>Roteiro 1: "A Maria vendeu"</w:t>
       </w:r>
     </w:p>
     <w:p>
@@ -676,40 +676,26 @@
         <w:tblLook w:firstColumn="1" w:firstRow="1" w:lastColumn="0" w:lastRow="0" w:noHBand="0" w:noVBand="1" w:val="04A0"/>
       </w:tblPr>
       <w:tblGrid>
-        <w:gridCol w:w="2880"/>
-        <w:gridCol w:w="2880"/>
-        <w:gridCol w:w="2880"/>
+        <w:gridCol w:w="4320"/>
+        <w:gridCol w:w="4320"/>
       </w:tblGrid>
       <w:tr>
         <w:tc>
           <w:tcPr>
-            <w:tcW w:type="dxa" w:w="2880"/>
+            <w:tcW w:type="dxa" w:w="4320"/>
           </w:tcPr>
           <w:p>
             <w:r>
               <w:rPr>
                 <w:b/>
               </w:rPr>
-              <w:t>Tempo</w:t>
+              <w:t>Visual</w:t>
             </w:r>
           </w:p>
         </w:tc>
         <w:tc>
           <w:tcPr>
-            <w:tcW w:type="dxa" w:w="2880"/>
-          </w:tcPr>
-          <w:p>
-            <w:r>
-              <w:rPr>
-                <w:b/>
-              </w:rPr>
-              <w:t>Visual</w:t>
-            </w:r>
-          </w:p>
-        </w:tc>
-        <w:tc>
-          <w:tcPr>
-            <w:tcW w:type="dxa" w:w="2880"/>
+            <w:tcW w:type="dxa" w:w="4320"/>
           </w:tcPr>
           <w:p>
             <w:r>
@@ -724,27 +710,17 @@
       <w:tr>
         <w:tc>
           <w:tcPr>
-            <w:tcW w:type="dxa" w:w="2880"/>
+            <w:tcW w:type="dxa" w:w="4320"/>
           </w:tcPr>
           <w:p>
             <w:r>
-              <w:t>0–4s</w:t>
+              <w:t>Você à câmera, rosto sério, depois sorriso</w:t>
             </w:r>
           </w:p>
         </w:tc>
         <w:tc>
           <w:tcPr>
-            <w:tcW w:type="dxa" w:w="2880"/>
-          </w:tcPr>
-          <w:p>
-            <w:r>
-              <w:t>Você à câmera, rosto sério, depois sorriso</w:t>
-            </w:r>
-          </w:p>
-        </w:tc>
-        <w:tc>
-          <w:tcPr>
-            <w:tcW w:type="dxa" w:w="2880"/>
+            <w:tcW w:type="dxa" w:w="4320"/>
           </w:tcPr>
           <w:p>
             <w:r>
@@ -756,27 +732,17 @@
       <w:tr>
         <w:tc>
           <w:tcPr>
-            <w:tcW w:type="dxa" w:w="2880"/>
+            <w:tcW w:type="dxa" w:w="4320"/>
           </w:tcPr>
           <w:p>
             <w:r>
-              <w:t>4–12s</w:t>
+              <w:t>Foto da [Maria] com a necessaire ou print do papo dela</w:t>
             </w:r>
           </w:p>
         </w:tc>
         <w:tc>
           <w:tcPr>
-            <w:tcW w:type="dxa" w:w="2880"/>
-          </w:tcPr>
-          <w:p>
-            <w:r>
-              <w:t>Foto da [Maria] com a necessaire ou print do papo dela</w:t>
-            </w:r>
-          </w:p>
-        </w:tc>
-        <w:tc>
-          <w:tcPr>
-            <w:tcW w:type="dxa" w:w="2880"/>
+            <w:tcW w:type="dxa" w:w="4320"/>
           </w:tcPr>
           <w:p>
             <w:r>
@@ -788,27 +754,17 @@
       <w:tr>
         <w:tc>
           <w:tcPr>
-            <w:tcW w:type="dxa" w:w="2880"/>
+            <w:tcW w:type="dxa" w:w="4320"/>
           </w:tcPr>
           <w:p>
             <w:r>
-              <w:t>12–24s</w:t>
+              <w:t>Mostre a necessaire pronta, de perto: costura, zíper, forro</w:t>
             </w:r>
           </w:p>
         </w:tc>
         <w:tc>
           <w:tcPr>
-            <w:tcW w:type="dxa" w:w="2880"/>
-          </w:tcPr>
-          <w:p>
-            <w:r>
-              <w:t>Mostre a necessaire pronta, de perto: costura, zíper, forro</w:t>
-            </w:r>
-          </w:p>
-        </w:tc>
-        <w:tc>
-          <w:tcPr>
-            <w:tcW w:type="dxa" w:w="2880"/>
+            <w:tcW w:type="dxa" w:w="4320"/>
           </w:tcPr>
           <w:p>
             <w:r>
@@ -838,27 +794,17 @@
       <w:tr>
         <w:tc>
           <w:tcPr>
-            <w:tcW w:type="dxa" w:w="2880"/>
+            <w:tcW w:type="dxa" w:w="4320"/>
           </w:tcPr>
           <w:p>
             <w:r>
-              <w:t>24–36s</w:t>
+              <w:t>Print da venda, story ou mensagem da cliente dela (real)</w:t>
             </w:r>
           </w:p>
         </w:tc>
         <w:tc>
           <w:tcPr>
-            <w:tcW w:type="dxa" w:w="2880"/>
-          </w:tcPr>
-          <w:p>
-            <w:r>
-              <w:t>Print da venda, story ou mensagem da cliente dela (real)</w:t>
-            </w:r>
-          </w:p>
-        </w:tc>
-        <w:tc>
-          <w:tcPr>
-            <w:tcW w:type="dxa" w:w="2880"/>
+            <w:tcW w:type="dxa" w:w="4320"/>
           </w:tcPr>
           <w:p>
             <w:r>
@@ -906,27 +852,17 @@
       <w:tr>
         <w:tc>
           <w:tcPr>
-            <w:tcW w:type="dxa" w:w="2880"/>
+            <w:tcW w:type="dxa" w:w="4320"/>
           </w:tcPr>
           <w:p>
             <w:r>
-              <w:t>36–46s</w:t>
+              <w:t>Você à câmera</w:t>
             </w:r>
           </w:p>
         </w:tc>
         <w:tc>
           <w:tcPr>
-            <w:tcW w:type="dxa" w:w="2880"/>
-          </w:tcPr>
-          <w:p>
-            <w:r>
-              <w:t>Você à câmera</w:t>
-            </w:r>
-          </w:p>
-        </w:tc>
-        <w:tc>
-          <w:tcPr>
-            <w:tcW w:type="dxa" w:w="2880"/>
+            <w:tcW w:type="dxa" w:w="4320"/>
           </w:tcPr>
           <w:p>
             <w:r>
@@ -975,7 +911,7 @@
         <w:pStyle w:val="Heading2"/>
       </w:pPr>
       <w:r>
-        <w:t>Roteiro 2: "5 alunas, 5 resultados" (Reels, 50 a 60s)</w:t>
+        <w:t>Roteiro 2: "5 alunas, 5 resultados"</w:t>
       </w:r>
     </w:p>
     <w:p>
@@ -1046,40 +982,26 @@
         <w:tblLook w:firstColumn="1" w:firstRow="1" w:lastColumn="0" w:lastRow="0" w:noHBand="0" w:noVBand="1" w:val="04A0"/>
       </w:tblPr>
       <w:tblGrid>
-        <w:gridCol w:w="2880"/>
-        <w:gridCol w:w="2880"/>
-        <w:gridCol w:w="2880"/>
+        <w:gridCol w:w="4320"/>
+        <w:gridCol w:w="4320"/>
       </w:tblGrid>
       <w:tr>
         <w:tc>
           <w:tcPr>
-            <w:tcW w:type="dxa" w:w="2880"/>
+            <w:tcW w:type="dxa" w:w="4320"/>
           </w:tcPr>
           <w:p>
             <w:r>
               <w:rPr>
                 <w:b/>
               </w:rPr>
-              <w:t>Tempo</w:t>
+              <w:t>Visual</w:t>
             </w:r>
           </w:p>
         </w:tc>
         <w:tc>
           <w:tcPr>
-            <w:tcW w:type="dxa" w:w="2880"/>
-          </w:tcPr>
-          <w:p>
-            <w:r>
-              <w:rPr>
-                <w:b/>
-              </w:rPr>
-              <w:t>Visual</w:t>
-            </w:r>
-          </w:p>
-        </w:tc>
-        <w:tc>
-          <w:tcPr>
-            <w:tcW w:type="dxa" w:w="2880"/>
+            <w:tcW w:type="dxa" w:w="4320"/>
           </w:tcPr>
           <w:p>
             <w:r>
@@ -1094,27 +1016,17 @@
       <w:tr>
         <w:tc>
           <w:tcPr>
-            <w:tcW w:type="dxa" w:w="2880"/>
+            <w:tcW w:type="dxa" w:w="4320"/>
           </w:tcPr>
           <w:p>
             <w:r>
-              <w:t>0–4s</w:t>
+              <w:t>Você à câmera com 5 fotos atrás</w:t>
             </w:r>
           </w:p>
         </w:tc>
         <w:tc>
           <w:tcPr>
-            <w:tcW w:type="dxa" w:w="2880"/>
-          </w:tcPr>
-          <w:p>
-            <w:r>
-              <w:t>Você à câmera com 5 fotos atrás</w:t>
-            </w:r>
-          </w:p>
-        </w:tc>
-        <w:tc>
-          <w:tcPr>
-            <w:tcW w:type="dxa" w:w="2880"/>
+            <w:tcW w:type="dxa" w:w="4320"/>
           </w:tcPr>
           <w:p>
             <w:r>
@@ -1126,27 +1038,17 @@
       <w:tr>
         <w:tc>
           <w:tcPr>
-            <w:tcW w:type="dxa" w:w="2880"/>
+            <w:tcW w:type="dxa" w:w="4320"/>
           </w:tcPr>
           <w:p>
             <w:r>
-              <w:t>4–10s</w:t>
+              <w:t>Foto da aluna 1 + número na tela</w:t>
             </w:r>
           </w:p>
         </w:tc>
         <w:tc>
           <w:tcPr>
-            <w:tcW w:type="dxa" w:w="2880"/>
-          </w:tcPr>
-          <w:p>
-            <w:r>
-              <w:t>Foto da aluna 1 + número na tela</w:t>
-            </w:r>
-          </w:p>
-        </w:tc>
-        <w:tc>
-          <w:tcPr>
-            <w:tcW w:type="dxa" w:w="2880"/>
+            <w:tcW w:type="dxa" w:w="4320"/>
           </w:tcPr>
           <w:p>
             <w:r>
@@ -1176,27 +1078,17 @@
       <w:tr>
         <w:tc>
           <w:tcPr>
-            <w:tcW w:type="dxa" w:w="2880"/>
+            <w:tcW w:type="dxa" w:w="4320"/>
           </w:tcPr>
           <w:p>
             <w:r>
-              <w:t>10–16s</w:t>
+              <w:t>Aluna 2</w:t>
             </w:r>
           </w:p>
         </w:tc>
         <w:tc>
           <w:tcPr>
-            <w:tcW w:type="dxa" w:w="2880"/>
-          </w:tcPr>
-          <w:p>
-            <w:r>
-              <w:t>Aluna 2</w:t>
-            </w:r>
-          </w:p>
-        </w:tc>
-        <w:tc>
-          <w:tcPr>
-            <w:tcW w:type="dxa" w:w="2880"/>
+            <w:tcW w:type="dxa" w:w="4320"/>
           </w:tcPr>
           <w:p>
             <w:r>
@@ -1226,27 +1118,17 @@
       <w:tr>
         <w:tc>
           <w:tcPr>
-            <w:tcW w:type="dxa" w:w="2880"/>
+            <w:tcW w:type="dxa" w:w="4320"/>
           </w:tcPr>
           <w:p>
             <w:r>
-              <w:t>16–22s</w:t>
+              <w:t>Aluna 3</w:t>
             </w:r>
           </w:p>
         </w:tc>
         <w:tc>
           <w:tcPr>
-            <w:tcW w:type="dxa" w:w="2880"/>
-          </w:tcPr>
-          <w:p>
-            <w:r>
-              <w:t>Aluna 3</w:t>
-            </w:r>
-          </w:p>
-        </w:tc>
-        <w:tc>
-          <w:tcPr>
-            <w:tcW w:type="dxa" w:w="2880"/>
+            <w:tcW w:type="dxa" w:w="4320"/>
           </w:tcPr>
           <w:p>
             <w:r>
@@ -1276,27 +1158,17 @@
       <w:tr>
         <w:tc>
           <w:tcPr>
-            <w:tcW w:type="dxa" w:w="2880"/>
+            <w:tcW w:type="dxa" w:w="4320"/>
           </w:tcPr>
           <w:p>
             <w:r>
-              <w:t>22–28s</w:t>
+              <w:t>Aluna 4</w:t>
             </w:r>
           </w:p>
         </w:tc>
         <w:tc>
           <w:tcPr>
-            <w:tcW w:type="dxa" w:w="2880"/>
-          </w:tcPr>
-          <w:p>
-            <w:r>
-              <w:t>Aluna 4</w:t>
-            </w:r>
-          </w:p>
-        </w:tc>
-        <w:tc>
-          <w:tcPr>
-            <w:tcW w:type="dxa" w:w="2880"/>
+            <w:tcW w:type="dxa" w:w="4320"/>
           </w:tcPr>
           <w:p>
             <w:r>
@@ -1326,27 +1198,17 @@
       <w:tr>
         <w:tc>
           <w:tcPr>
-            <w:tcW w:type="dxa" w:w="2880"/>
+            <w:tcW w:type="dxa" w:w="4320"/>
           </w:tcPr>
           <w:p>
             <w:r>
-              <w:t>28–34s</w:t>
+              <w:t>Aluna 5</w:t>
             </w:r>
           </w:p>
         </w:tc>
         <w:tc>
           <w:tcPr>
-            <w:tcW w:type="dxa" w:w="2880"/>
-          </w:tcPr>
-          <w:p>
-            <w:r>
-              <w:t>Aluna 5</w:t>
-            </w:r>
-          </w:p>
-        </w:tc>
-        <w:tc>
-          <w:tcPr>
-            <w:tcW w:type="dxa" w:w="2880"/>
+            <w:tcW w:type="dxa" w:w="4320"/>
           </w:tcPr>
           <w:p>
             <w:r>
@@ -1376,27 +1238,17 @@
       <w:tr>
         <w:tc>
           <w:tcPr>
-            <w:tcW w:type="dxa" w:w="2880"/>
+            <w:tcW w:type="dxa" w:w="4320"/>
           </w:tcPr>
           <w:p>
             <w:r>
-              <w:t>34–48s</w:t>
+              <w:t>Você à câmera</w:t>
             </w:r>
           </w:p>
         </w:tc>
         <w:tc>
           <w:tcPr>
-            <w:tcW w:type="dxa" w:w="2880"/>
-          </w:tcPr>
-          <w:p>
-            <w:r>
-              <w:t>Você à câmera</w:t>
-            </w:r>
-          </w:p>
-        </w:tc>
-        <w:tc>
-          <w:tcPr>
-            <w:tcW w:type="dxa" w:w="2880"/>
+            <w:tcW w:type="dxa" w:w="4320"/>
           </w:tcPr>
           <w:p>
             <w:r>
@@ -1417,27 +1269,17 @@
       <w:tr>
         <w:tc>
           <w:tcPr>
-            <w:tcW w:type="dxa" w:w="2880"/>
+            <w:tcW w:type="dxa" w:w="4320"/>
           </w:tcPr>
           <w:p>
             <w:r>
-              <w:t>48–58s</w:t>
+              <w:t>Você à câmera</w:t>
             </w:r>
           </w:p>
         </w:tc>
         <w:tc>
           <w:tcPr>
-            <w:tcW w:type="dxa" w:w="2880"/>
-          </w:tcPr>
-          <w:p>
-            <w:r>
-              <w:t>Você à câmera</w:t>
-            </w:r>
-          </w:p>
-        </w:tc>
-        <w:tc>
-          <w:tcPr>
-            <w:tcW w:type="dxa" w:w="2880"/>
+            <w:tcW w:type="dxa" w:w="4320"/>
           </w:tcPr>
           <w:p>
             <w:r>
@@ -1484,7 +1326,7 @@
         <w:pStyle w:val="Heading2"/>
       </w:pPr>
       <w:r>
-        <w:t>Roteiro 3: "Ela achou que não ia vender" (print de WhatsApp, 25 a 35s)</w:t>
+        <w:t>Roteiro 3: "Ela achou que não ia vender"</w:t>
       </w:r>
     </w:p>
     <w:p>
@@ -1537,40 +1379,26 @@
         <w:tblLook w:firstColumn="1" w:firstRow="1" w:lastColumn="0" w:lastRow="0" w:noHBand="0" w:noVBand="1" w:val="04A0"/>
       </w:tblPr>
       <w:tblGrid>
-        <w:gridCol w:w="2880"/>
-        <w:gridCol w:w="2880"/>
-        <w:gridCol w:w="2880"/>
+        <w:gridCol w:w="4320"/>
+        <w:gridCol w:w="4320"/>
       </w:tblGrid>
       <w:tr>
         <w:tc>
           <w:tcPr>
-            <w:tcW w:type="dxa" w:w="2880"/>
+            <w:tcW w:type="dxa" w:w="4320"/>
           </w:tcPr>
           <w:p>
             <w:r>
               <w:rPr>
                 <w:b/>
               </w:rPr>
-              <w:t>Tempo</w:t>
+              <w:t>Visual</w:t>
             </w:r>
           </w:p>
         </w:tc>
         <w:tc>
           <w:tcPr>
-            <w:tcW w:type="dxa" w:w="2880"/>
-          </w:tcPr>
-          <w:p>
-            <w:r>
-              <w:rPr>
-                <w:b/>
-              </w:rPr>
-              <w:t>Visual</w:t>
-            </w:r>
-          </w:p>
-        </w:tc>
-        <w:tc>
-          <w:tcPr>
-            <w:tcW w:type="dxa" w:w="2880"/>
+            <w:tcW w:type="dxa" w:w="4320"/>
           </w:tcPr>
           <w:p>
             <w:r>
@@ -1585,27 +1413,17 @@
       <w:tr>
         <w:tc>
           <w:tcPr>
-            <w:tcW w:type="dxa" w:w="2880"/>
+            <w:tcW w:type="dxa" w:w="4320"/>
           </w:tcPr>
           <w:p>
             <w:r>
-              <w:t>0–3s</w:t>
+              <w:t>Print da mensagem (real), com a foto da aluna cobrindo nome se ela não autorizar</w:t>
             </w:r>
           </w:p>
         </w:tc>
         <w:tc>
           <w:tcPr>
-            <w:tcW w:type="dxa" w:w="2880"/>
-          </w:tcPr>
-          <w:p>
-            <w:r>
-              <w:t>Print da mensagem (real), com a foto da aluna cobrindo nome se ela não autorizar</w:t>
-            </w:r>
-          </w:p>
-        </w:tc>
-        <w:tc>
-          <w:tcPr>
-            <w:tcW w:type="dxa" w:w="2880"/>
+            <w:tcW w:type="dxa" w:w="4320"/>
           </w:tcPr>
           <w:p>
             <w:r>
@@ -1617,27 +1435,17 @@
       <w:tr>
         <w:tc>
           <w:tcPr>
-            <w:tcW w:type="dxa" w:w="2880"/>
+            <w:tcW w:type="dxa" w:w="4320"/>
           </w:tcPr>
           <w:p>
             <w:r>
-              <w:t>3–12s</w:t>
+              <w:t>Zoom na mensagem, lendo</w:t>
             </w:r>
           </w:p>
         </w:tc>
         <w:tc>
           <w:tcPr>
-            <w:tcW w:type="dxa" w:w="2880"/>
-          </w:tcPr>
-          <w:p>
-            <w:r>
-              <w:t>Zoom na mensagem, lendo</w:t>
-            </w:r>
-          </w:p>
-        </w:tc>
-        <w:tc>
-          <w:tcPr>
-            <w:tcW w:type="dxa" w:w="2880"/>
+            <w:tcW w:type="dxa" w:w="4320"/>
           </w:tcPr>
           <w:p>
             <w:r>
@@ -1658,27 +1466,17 @@
       <w:tr>
         <w:tc>
           <w:tcPr>
-            <w:tcW w:type="dxa" w:w="2880"/>
+            <w:tcW w:type="dxa" w:w="4320"/>
           </w:tcPr>
           <w:p>
             <w:r>
-              <w:t>12–22s</w:t>
+              <w:t>Você à câmera</w:t>
             </w:r>
           </w:p>
         </w:tc>
         <w:tc>
           <w:tcPr>
-            <w:tcW w:type="dxa" w:w="2880"/>
-          </w:tcPr>
-          <w:p>
-            <w:r>
-              <w:t>Você à câmera</w:t>
-            </w:r>
-          </w:p>
-        </w:tc>
-        <w:tc>
-          <w:tcPr>
-            <w:tcW w:type="dxa" w:w="2880"/>
+            <w:tcW w:type="dxa" w:w="4320"/>
           </w:tcPr>
           <w:p>
             <w:r>
@@ -1699,27 +1497,17 @@
       <w:tr>
         <w:tc>
           <w:tcPr>
-            <w:tcW w:type="dxa" w:w="2880"/>
+            <w:tcW w:type="dxa" w:w="4320"/>
           </w:tcPr>
           <w:p>
             <w:r>
-              <w:t>22–32s</w:t>
+              <w:t>Você à câmera</w:t>
             </w:r>
           </w:p>
         </w:tc>
         <w:tc>
           <w:tcPr>
-            <w:tcW w:type="dxa" w:w="2880"/>
-          </w:tcPr>
-          <w:p>
-            <w:r>
-              <w:t>Você à câmera</w:t>
-            </w:r>
-          </w:p>
-        </w:tc>
-        <w:tc>
-          <w:tcPr>
-            <w:tcW w:type="dxa" w:w="2880"/>
+            <w:tcW w:type="dxa" w:w="4320"/>
           </w:tcPr>
           <w:p>
             <w:r>
@@ -1765,7 +1553,7 @@
         <w:pStyle w:val="Heading2"/>
       </w:pPr>
       <w:r>
-        <w:t>Roteiro 4: "Você sabe fazer, mas não sabe vender" (Reels, 45 a 55s)</w:t>
+        <w:t>Roteiro 4: "Você sabe fazer, mas não sabe vender"</w:t>
       </w:r>
     </w:p>
     <w:p>
@@ -1816,40 +1604,26 @@
         <w:tblLook w:firstColumn="1" w:firstRow="1" w:lastColumn="0" w:lastRow="0" w:noHBand="0" w:noVBand="1" w:val="04A0"/>
       </w:tblPr>
       <w:tblGrid>
-        <w:gridCol w:w="2880"/>
-        <w:gridCol w:w="2880"/>
-        <w:gridCol w:w="2880"/>
+        <w:gridCol w:w="4320"/>
+        <w:gridCol w:w="4320"/>
       </w:tblGrid>
       <w:tr>
         <w:tc>
           <w:tcPr>
-            <w:tcW w:type="dxa" w:w="2880"/>
+            <w:tcW w:type="dxa" w:w="4320"/>
           </w:tcPr>
           <w:p>
             <w:r>
               <w:rPr>
                 <w:b/>
               </w:rPr>
-              <w:t>Tempo</w:t>
+              <w:t>Visual</w:t>
             </w:r>
           </w:p>
         </w:tc>
         <w:tc>
           <w:tcPr>
-            <w:tcW w:type="dxa" w:w="2880"/>
-          </w:tcPr>
-          <w:p>
-            <w:r>
-              <w:rPr>
-                <w:b/>
-              </w:rPr>
-              <w:t>Visual</w:t>
-            </w:r>
-          </w:p>
-        </w:tc>
-        <w:tc>
-          <w:tcPr>
-            <w:tcW w:type="dxa" w:w="2880"/>
+            <w:tcW w:type="dxa" w:w="4320"/>
           </w:tcPr>
           <w:p>
             <w:r>
@@ -1864,27 +1638,17 @@
       <w:tr>
         <w:tc>
           <w:tcPr>
-            <w:tcW w:type="dxa" w:w="2880"/>
+            <w:tcW w:type="dxa" w:w="4320"/>
           </w:tcPr>
           <w:p>
             <w:r>
-              <w:t>0–4s</w:t>
+              <w:t>Você segurando uma peça, cara de quem já passou por isso</w:t>
             </w:r>
           </w:p>
         </w:tc>
         <w:tc>
           <w:tcPr>
-            <w:tcW w:type="dxa" w:w="2880"/>
-          </w:tcPr>
-          <w:p>
-            <w:r>
-              <w:t>Você segurando uma peça, cara de quem já passou por isso</w:t>
-            </w:r>
-          </w:p>
-        </w:tc>
-        <w:tc>
-          <w:tcPr>
-            <w:tcW w:type="dxa" w:w="2880"/>
+            <w:tcW w:type="dxa" w:w="4320"/>
           </w:tcPr>
           <w:p>
             <w:r>
@@ -1896,27 +1660,17 @@
       <w:tr>
         <w:tc>
           <w:tcPr>
-            <w:tcW w:type="dxa" w:w="2880"/>
+            <w:tcW w:type="dxa" w:w="4320"/>
           </w:tcPr>
           <w:p>
             <w:r>
-              <w:t>4–14s</w:t>
+              <w:t>Mostre gavetas ou prateleira com peças paradas</w:t>
             </w:r>
           </w:p>
         </w:tc>
         <w:tc>
           <w:tcPr>
-            <w:tcW w:type="dxa" w:w="2880"/>
-          </w:tcPr>
-          <w:p>
-            <w:r>
-              <w:t>Mostre gavetas ou prateleira com peças paradas</w:t>
-            </w:r>
-          </w:p>
-        </w:tc>
-        <w:tc>
-          <w:tcPr>
-            <w:tcW w:type="dxa" w:w="2880"/>
+            <w:tcW w:type="dxa" w:w="4320"/>
           </w:tcPr>
           <w:p>
             <w:r>
@@ -1928,27 +1682,17 @@
       <w:tr>
         <w:tc>
           <w:tcPr>
-            <w:tcW w:type="dxa" w:w="2880"/>
+            <w:tcW w:type="dxa" w:w="4320"/>
           </w:tcPr>
           <w:p>
             <w:r>
-              <w:t>14–26s</w:t>
+              <w:t>Você à câmera, tom de explicação</w:t>
             </w:r>
           </w:p>
         </w:tc>
         <w:tc>
           <w:tcPr>
-            <w:tcW w:type="dxa" w:w="2880"/>
-          </w:tcPr>
-          <w:p>
-            <w:r>
-              <w:t>Você à câmera, tom de explicação</w:t>
-            </w:r>
-          </w:p>
-        </w:tc>
-        <w:tc>
-          <w:tcPr>
-            <w:tcW w:type="dxa" w:w="2880"/>
+            <w:tcW w:type="dxa" w:w="4320"/>
           </w:tcPr>
           <w:p>
             <w:r>
@@ -1978,36 +1722,26 @@
       <w:tr>
         <w:tc>
           <w:tcPr>
-            <w:tcW w:type="dxa" w:w="2880"/>
+            <w:tcW w:type="dxa" w:w="4320"/>
           </w:tcPr>
           <w:p>
             <w:r>
-              <w:t>26–40s</w:t>
+              <w:t xml:space="preserve">Mostre a </w:t>
+            </w:r>
+            <w:r>
+              <w:rPr>
+                <w:b/>
+              </w:rPr>
+              <w:t>Necessaire Make</w:t>
+            </w:r>
+            <w:r>
+              <w:t xml:space="preserve"> pronta</w:t>
             </w:r>
           </w:p>
         </w:tc>
         <w:tc>
           <w:tcPr>
-            <w:tcW w:type="dxa" w:w="2880"/>
-          </w:tcPr>
-          <w:p>
-            <w:r>
-              <w:t xml:space="preserve">Mostre a </w:t>
-            </w:r>
-            <w:r>
-              <w:rPr>
-                <w:b/>
-              </w:rPr>
-              <w:t>Necessaire Make</w:t>
-            </w:r>
-            <w:r>
-              <w:t xml:space="preserve"> pronta</w:t>
-            </w:r>
-          </w:p>
-        </w:tc>
-        <w:tc>
-          <w:tcPr>
-            <w:tcW w:type="dxa" w:w="2880"/>
+            <w:tcW w:type="dxa" w:w="4320"/>
           </w:tcPr>
           <w:p>
             <w:r>
@@ -2046,27 +1780,17 @@
       <w:tr>
         <w:tc>
           <w:tcPr>
-            <w:tcW w:type="dxa" w:w="2880"/>
+            <w:tcW w:type="dxa" w:w="4320"/>
           </w:tcPr>
           <w:p>
             <w:r>
-              <w:t>40–52s</w:t>
+              <w:t>Você à câmera</w:t>
             </w:r>
           </w:p>
         </w:tc>
         <w:tc>
           <w:tcPr>
-            <w:tcW w:type="dxa" w:w="2880"/>
-          </w:tcPr>
-          <w:p>
-            <w:r>
-              <w:t>Você à câmera</w:t>
-            </w:r>
-          </w:p>
-        </w:tc>
-        <w:tc>
-          <w:tcPr>
-            <w:tcW w:type="dxa" w:w="2880"/>
+            <w:tcW w:type="dxa" w:w="4320"/>
           </w:tcPr>
           <w:p>
             <w:r>
@@ -2093,7 +1817,7 @@
         <w:pStyle w:val="Heading2"/>
       </w:pPr>
       <w:r>
-        <w:t>Roteiro 5: "A matemática do lucro" (Reels, 40 a 50s)</w:t>
+        <w:t>Roteiro 5: "A matemática do lucro"</w:t>
       </w:r>
     </w:p>
     <w:p>
@@ -2144,40 +1868,26 @@
         <w:tblLook w:firstColumn="1" w:firstRow="1" w:lastColumn="0" w:lastRow="0" w:noHBand="0" w:noVBand="1" w:val="04A0"/>
       </w:tblPr>
       <w:tblGrid>
-        <w:gridCol w:w="2880"/>
-        <w:gridCol w:w="2880"/>
-        <w:gridCol w:w="2880"/>
+        <w:gridCol w:w="4320"/>
+        <w:gridCol w:w="4320"/>
       </w:tblGrid>
       <w:tr>
         <w:tc>
           <w:tcPr>
-            <w:tcW w:type="dxa" w:w="2880"/>
+            <w:tcW w:type="dxa" w:w="4320"/>
           </w:tcPr>
           <w:p>
             <w:r>
               <w:rPr>
                 <w:b/>
               </w:rPr>
-              <w:t>Tempo</w:t>
+              <w:t>Visual</w:t>
             </w:r>
           </w:p>
         </w:tc>
         <w:tc>
           <w:tcPr>
-            <w:tcW w:type="dxa" w:w="2880"/>
-          </w:tcPr>
-          <w:p>
-            <w:r>
-              <w:rPr>
-                <w:b/>
-              </w:rPr>
-              <w:t>Visual</w:t>
-            </w:r>
-          </w:p>
-        </w:tc>
-        <w:tc>
-          <w:tcPr>
-            <w:tcW w:type="dxa" w:w="2880"/>
+            <w:tcW w:type="dxa" w:w="4320"/>
           </w:tcPr>
           <w:p>
             <w:r>
@@ -2192,27 +1902,17 @@
       <w:tr>
         <w:tc>
           <w:tcPr>
-            <w:tcW w:type="dxa" w:w="2880"/>
+            <w:tcW w:type="dxa" w:w="4320"/>
           </w:tcPr>
           <w:p>
             <w:r>
-              <w:t>0–4s</w:t>
+              <w:t>Calculadora na tela ou papel e caneta</w:t>
             </w:r>
           </w:p>
         </w:tc>
         <w:tc>
           <w:tcPr>
-            <w:tcW w:type="dxa" w:w="2880"/>
-          </w:tcPr>
-          <w:p>
-            <w:r>
-              <w:t>Calculadora na tela ou papel e caneta</w:t>
-            </w:r>
-          </w:p>
-        </w:tc>
-        <w:tc>
-          <w:tcPr>
-            <w:tcW w:type="dxa" w:w="2880"/>
+            <w:tcW w:type="dxa" w:w="4320"/>
           </w:tcPr>
           <w:p>
             <w:r>
@@ -2224,27 +1924,17 @@
       <w:tr>
         <w:tc>
           <w:tcPr>
-            <w:tcW w:type="dxa" w:w="2880"/>
+            <w:tcW w:type="dxa" w:w="4320"/>
           </w:tcPr>
           <w:p>
             <w:r>
-              <w:t>4–14s</w:t>
+              <w:t>Escreva na tela conforme fala</w:t>
             </w:r>
           </w:p>
         </w:tc>
         <w:tc>
           <w:tcPr>
-            <w:tcW w:type="dxa" w:w="2880"/>
-          </w:tcPr>
-          <w:p>
-            <w:r>
-              <w:t>Escreva na tela conforme fala</w:t>
-            </w:r>
-          </w:p>
-        </w:tc>
-        <w:tc>
-          <w:tcPr>
-            <w:tcW w:type="dxa" w:w="2880"/>
+            <w:tcW w:type="dxa" w:w="4320"/>
           </w:tcPr>
           <w:p>
             <w:r>
@@ -2283,27 +1973,17 @@
       <w:tr>
         <w:tc>
           <w:tcPr>
-            <w:tcW w:type="dxa" w:w="2880"/>
+            <w:tcW w:type="dxa" w:w="4320"/>
           </w:tcPr>
           <w:p>
             <w:r>
-              <w:t>14–26s</w:t>
+              <w:t>Multiplique na tela</w:t>
             </w:r>
           </w:p>
         </w:tc>
         <w:tc>
           <w:tcPr>
-            <w:tcW w:type="dxa" w:w="2880"/>
-          </w:tcPr>
-          <w:p>
-            <w:r>
-              <w:t>Multiplique na tela</w:t>
-            </w:r>
-          </w:p>
-        </w:tc>
-        <w:tc>
-          <w:tcPr>
-            <w:tcW w:type="dxa" w:w="2880"/>
+            <w:tcW w:type="dxa" w:w="4320"/>
           </w:tcPr>
           <w:p>
             <w:r>
@@ -2351,33 +2031,23 @@
       <w:tr>
         <w:tc>
           <w:tcPr>
-            <w:tcW w:type="dxa" w:w="2880"/>
+            <w:tcW w:type="dxa" w:w="4320"/>
           </w:tcPr>
           <w:p>
             <w:r>
-              <w:t>26–38s</w:t>
+              <w:t xml:space="preserve">Mostre a </w:t>
+            </w:r>
+            <w:r>
+              <w:rPr>
+                <w:b/>
+              </w:rPr>
+              <w:t>Térmica Mimo</w:t>
             </w:r>
           </w:p>
         </w:tc>
         <w:tc>
           <w:tcPr>
-            <w:tcW w:type="dxa" w:w="2880"/>
-          </w:tcPr>
-          <w:p>
-            <w:r>
-              <w:t xml:space="preserve">Mostre a </w:t>
-            </w:r>
-            <w:r>
-              <w:rPr>
-                <w:b/>
-              </w:rPr>
-              <w:t>Térmica Mimo</w:t>
-            </w:r>
-          </w:p>
-        </w:tc>
-        <w:tc>
-          <w:tcPr>
-            <w:tcW w:type="dxa" w:w="2880"/>
+            <w:tcW w:type="dxa" w:w="4320"/>
           </w:tcPr>
           <w:p>
             <w:r>
@@ -2407,27 +2077,17 @@
       <w:tr>
         <w:tc>
           <w:tcPr>
-            <w:tcW w:type="dxa" w:w="2880"/>
+            <w:tcW w:type="dxa" w:w="4320"/>
           </w:tcPr>
           <w:p>
             <w:r>
-              <w:t>38–48s</w:t>
+              <w:t>Você à câmera</w:t>
             </w:r>
           </w:p>
         </w:tc>
         <w:tc>
           <w:tcPr>
-            <w:tcW w:type="dxa" w:w="2880"/>
-          </w:tcPr>
-          <w:p>
-            <w:r>
-              <w:t>Você à câmera</w:t>
-            </w:r>
-          </w:p>
-        </w:tc>
-        <w:tc>
-          <w:tcPr>
-            <w:tcW w:type="dxa" w:w="2880"/>
+            <w:tcW w:type="dxa" w:w="4320"/>
           </w:tcPr>
           <w:p>
             <w:r>
@@ -2460,7 +2120,7 @@
         <w:pStyle w:val="Heading2"/>
       </w:pPr>
       <w:r>
-        <w:t>Roteiro 6: "Ninguém paga R$ 130 numa necessaire" (Reels, 45 a 55s)</w:t>
+        <w:t>Roteiro 6: "Ninguém paga R$ 130 numa necessaire"</w:t>
       </w:r>
     </w:p>
     <w:p>
@@ -2513,40 +2173,26 @@
         <w:tblLook w:firstColumn="1" w:firstRow="1" w:lastColumn="0" w:lastRow="0" w:noHBand="0" w:noVBand="1" w:val="04A0"/>
       </w:tblPr>
       <w:tblGrid>
-        <w:gridCol w:w="2880"/>
-        <w:gridCol w:w="2880"/>
-        <w:gridCol w:w="2880"/>
+        <w:gridCol w:w="4320"/>
+        <w:gridCol w:w="4320"/>
       </w:tblGrid>
       <w:tr>
         <w:tc>
           <w:tcPr>
-            <w:tcW w:type="dxa" w:w="2880"/>
+            <w:tcW w:type="dxa" w:w="4320"/>
           </w:tcPr>
           <w:p>
             <w:r>
               <w:rPr>
                 <w:b/>
               </w:rPr>
-              <w:t>Tempo</w:t>
+              <w:t>Visual</w:t>
             </w:r>
           </w:p>
         </w:tc>
         <w:tc>
           <w:tcPr>
-            <w:tcW w:type="dxa" w:w="2880"/>
-          </w:tcPr>
-          <w:p>
-            <w:r>
-              <w:rPr>
-                <w:b/>
-              </w:rPr>
-              <w:t>Visual</w:t>
-            </w:r>
-          </w:p>
-        </w:tc>
-        <w:tc>
-          <w:tcPr>
-            <w:tcW w:type="dxa" w:w="2880"/>
+            <w:tcW w:type="dxa" w:w="4320"/>
           </w:tcPr>
           <w:p>
             <w:r>
@@ -2561,27 +2207,17 @@
       <w:tr>
         <w:tc>
           <w:tcPr>
-            <w:tcW w:type="dxa" w:w="2880"/>
+            <w:tcW w:type="dxa" w:w="4320"/>
           </w:tcPr>
           <w:p>
             <w:r>
-              <w:t>0–4s</w:t>
+              <w:t>Você à câmera, tom desafiador</w:t>
             </w:r>
           </w:p>
         </w:tc>
         <w:tc>
           <w:tcPr>
-            <w:tcW w:type="dxa" w:w="2880"/>
-          </w:tcPr>
-          <w:p>
-            <w:r>
-              <w:t>Você à câmera, tom desafiador</w:t>
-            </w:r>
-          </w:p>
-        </w:tc>
-        <w:tc>
-          <w:tcPr>
-            <w:tcW w:type="dxa" w:w="2880"/>
+            <w:tcW w:type="dxa" w:w="4320"/>
           </w:tcPr>
           <w:p>
             <w:r>
@@ -2593,33 +2229,23 @@
       <w:tr>
         <w:tc>
           <w:tcPr>
-            <w:tcW w:type="dxa" w:w="2880"/>
+            <w:tcW w:type="dxa" w:w="4320"/>
           </w:tcPr>
           <w:p>
             <w:r>
-              <w:t>4–14s</w:t>
+              <w:t xml:space="preserve">Mostre uma necessaire de loja barata ao lado da </w:t>
+            </w:r>
+            <w:r>
+              <w:rPr>
+                <w:b/>
+              </w:rPr>
+              <w:t>Make</w:t>
             </w:r>
           </w:p>
         </w:tc>
         <w:tc>
           <w:tcPr>
-            <w:tcW w:type="dxa" w:w="2880"/>
-          </w:tcPr>
-          <w:p>
-            <w:r>
-              <w:t xml:space="preserve">Mostre uma necessaire de loja barata ao lado da </w:t>
-            </w:r>
-            <w:r>
-              <w:rPr>
-                <w:b/>
-              </w:rPr>
-              <w:t>Make</w:t>
-            </w:r>
-          </w:p>
-        </w:tc>
-        <w:tc>
-          <w:tcPr>
-            <w:tcW w:type="dxa" w:w="2880"/>
+            <w:tcW w:type="dxa" w:w="4320"/>
           </w:tcPr>
           <w:p>
             <w:r>
@@ -2640,27 +2266,17 @@
       <w:tr>
         <w:tc>
           <w:tcPr>
-            <w:tcW w:type="dxa" w:w="2880"/>
+            <w:tcW w:type="dxa" w:w="4320"/>
           </w:tcPr>
           <w:p>
             <w:r>
-              <w:t>14–28s</w:t>
+              <w:t>Close na costura, forro, zíper, tecido</w:t>
             </w:r>
           </w:p>
         </w:tc>
         <w:tc>
           <w:tcPr>
-            <w:tcW w:type="dxa" w:w="2880"/>
-          </w:tcPr>
-          <w:p>
-            <w:r>
-              <w:t>Close na costura, forro, zíper, tecido</w:t>
-            </w:r>
-          </w:p>
-        </w:tc>
-        <w:tc>
-          <w:tcPr>
-            <w:tcW w:type="dxa" w:w="2880"/>
+            <w:tcW w:type="dxa" w:w="4320"/>
           </w:tcPr>
           <w:p>
             <w:r>
@@ -2681,27 +2297,17 @@
       <w:tr>
         <w:tc>
           <w:tcPr>
-            <w:tcW w:type="dxa" w:w="2880"/>
+            <w:tcW w:type="dxa" w:w="4320"/>
           </w:tcPr>
           <w:p>
             <w:r>
-              <w:t>28–42s</w:t>
+              <w:t>Prints de clientes reais elogiando</w:t>
             </w:r>
           </w:p>
         </w:tc>
         <w:tc>
           <w:tcPr>
-            <w:tcW w:type="dxa" w:w="2880"/>
-          </w:tcPr>
-          <w:p>
-            <w:r>
-              <w:t>Prints de clientes reais elogiando</w:t>
-            </w:r>
-          </w:p>
-        </w:tc>
-        <w:tc>
-          <w:tcPr>
-            <w:tcW w:type="dxa" w:w="2880"/>
+            <w:tcW w:type="dxa" w:w="4320"/>
           </w:tcPr>
           <w:p>
             <w:r>
@@ -2731,27 +2337,17 @@
       <w:tr>
         <w:tc>
           <w:tcPr>
-            <w:tcW w:type="dxa" w:w="2880"/>
+            <w:tcW w:type="dxa" w:w="4320"/>
           </w:tcPr>
           <w:p>
             <w:r>
-              <w:t>42–52s</w:t>
+              <w:t>Você à câmera</w:t>
             </w:r>
           </w:p>
         </w:tc>
         <w:tc>
           <w:tcPr>
-            <w:tcW w:type="dxa" w:w="2880"/>
-          </w:tcPr>
-          <w:p>
-            <w:r>
-              <w:t>Você à câmera</w:t>
-            </w:r>
-          </w:p>
-        </w:tc>
-        <w:tc>
-          <w:tcPr>
-            <w:tcW w:type="dxa" w:w="2880"/>
+            <w:tcW w:type="dxa" w:w="4320"/>
           </w:tcPr>
           <w:p>
             <w:r>
@@ -2784,7 +2380,7 @@
         <w:pStyle w:val="Heading2"/>
       </w:pPr>
       <w:r>
-        <w:t>Roteiro 7: Mães e bebês (Reels, 40 a 50s)</w:t>
+        <w:t>Roteiro 7: Mães e bebês</w:t>
       </w:r>
     </w:p>
     <w:p>
@@ -2844,40 +2440,26 @@
         <w:tblLook w:firstColumn="1" w:firstRow="1" w:lastColumn="0" w:lastRow="0" w:noHBand="0" w:noVBand="1" w:val="04A0"/>
       </w:tblPr>
       <w:tblGrid>
-        <w:gridCol w:w="2880"/>
-        <w:gridCol w:w="2880"/>
-        <w:gridCol w:w="2880"/>
+        <w:gridCol w:w="4320"/>
+        <w:gridCol w:w="4320"/>
       </w:tblGrid>
       <w:tr>
         <w:tc>
           <w:tcPr>
-            <w:tcW w:type="dxa" w:w="2880"/>
+            <w:tcW w:type="dxa" w:w="4320"/>
           </w:tcPr>
           <w:p>
             <w:r>
               <w:rPr>
                 <w:b/>
               </w:rPr>
-              <w:t>Tempo</w:t>
+              <w:t>Visual</w:t>
             </w:r>
           </w:p>
         </w:tc>
         <w:tc>
           <w:tcPr>
-            <w:tcW w:type="dxa" w:w="2880"/>
-          </w:tcPr>
-          <w:p>
-            <w:r>
-              <w:rPr>
-                <w:b/>
-              </w:rPr>
-              <w:t>Visual</w:t>
-            </w:r>
-          </w:p>
-        </w:tc>
-        <w:tc>
-          <w:tcPr>
-            <w:tcW w:type="dxa" w:w="2880"/>
+            <w:tcW w:type="dxa" w:w="4320"/>
           </w:tcPr>
           <w:p>
             <w:r>
@@ -2892,27 +2474,17 @@
       <w:tr>
         <w:tc>
           <w:tcPr>
-            <w:tcW w:type="dxa" w:w="2880"/>
+            <w:tcW w:type="dxa" w:w="4320"/>
           </w:tcPr>
           <w:p>
             <w:r>
-              <w:t>0–4s</w:t>
+              <w:t>Mãe (ou simulação) com bebê e mamadeira</w:t>
             </w:r>
           </w:p>
         </w:tc>
         <w:tc>
           <w:tcPr>
-            <w:tcW w:type="dxa" w:w="2880"/>
-          </w:tcPr>
-          <w:p>
-            <w:r>
-              <w:t>Mãe (ou simulação) com bebê e mamadeira</w:t>
-            </w:r>
-          </w:p>
-        </w:tc>
-        <w:tc>
-          <w:tcPr>
-            <w:tcW w:type="dxa" w:w="2880"/>
+            <w:tcW w:type="dxa" w:w="4320"/>
           </w:tcPr>
           <w:p>
             <w:r>
@@ -2924,36 +2496,26 @@
       <w:tr>
         <w:tc>
           <w:tcPr>
-            <w:tcW w:type="dxa" w:w="2880"/>
+            <w:tcW w:type="dxa" w:w="4320"/>
           </w:tcPr>
           <w:p>
             <w:r>
-              <w:t>4–14s</w:t>
+              <w:t xml:space="preserve">Mostre a </w:t>
+            </w:r>
+            <w:r>
+              <w:rPr>
+                <w:b/>
+              </w:rPr>
+              <w:t>Térmica Mimo</w:t>
+            </w:r>
+            <w:r>
+              <w:t xml:space="preserve"> aberta, com a mamadeira dentro</w:t>
             </w:r>
           </w:p>
         </w:tc>
         <w:tc>
           <w:tcPr>
-            <w:tcW w:type="dxa" w:w="2880"/>
-          </w:tcPr>
-          <w:p>
-            <w:r>
-              <w:t xml:space="preserve">Mostre a </w:t>
-            </w:r>
-            <w:r>
-              <w:rPr>
-                <w:b/>
-              </w:rPr>
-              <w:t>Térmica Mimo</w:t>
-            </w:r>
-            <w:r>
-              <w:t xml:space="preserve"> aberta, com a mamadeira dentro</w:t>
-            </w:r>
-          </w:p>
-        </w:tc>
-        <w:tc>
-          <w:tcPr>
-            <w:tcW w:type="dxa" w:w="2880"/>
+            <w:tcW w:type="dxa" w:w="4320"/>
           </w:tcPr>
           <w:p>
             <w:r>
@@ -2974,27 +2536,17 @@
       <w:tr>
         <w:tc>
           <w:tcPr>
-            <w:tcW w:type="dxa" w:w="2880"/>
+            <w:tcW w:type="dxa" w:w="4320"/>
           </w:tcPr>
           <w:p>
             <w:r>
-              <w:t>14–26s</w:t>
+              <w:t>Close nos detalhes: alça, bolso, acabamento</w:t>
             </w:r>
           </w:p>
         </w:tc>
         <w:tc>
           <w:tcPr>
-            <w:tcW w:type="dxa" w:w="2880"/>
-          </w:tcPr>
-          <w:p>
-            <w:r>
-              <w:t>Close nos detalhes: alça, bolso, acabamento</w:t>
-            </w:r>
-          </w:p>
-        </w:tc>
-        <w:tc>
-          <w:tcPr>
-            <w:tcW w:type="dxa" w:w="2880"/>
+            <w:tcW w:type="dxa" w:w="4320"/>
           </w:tcPr>
           <w:p>
             <w:r>
@@ -3015,27 +2567,17 @@
       <w:tr>
         <w:tc>
           <w:tcPr>
-            <w:tcW w:type="dxa" w:w="2880"/>
+            <w:tcW w:type="dxa" w:w="4320"/>
           </w:tcPr>
           <w:p>
             <w:r>
-              <w:t>26–38s</w:t>
+              <w:t>Print de venda real</w:t>
             </w:r>
           </w:p>
         </w:tc>
         <w:tc>
           <w:tcPr>
-            <w:tcW w:type="dxa" w:w="2880"/>
-          </w:tcPr>
-          <w:p>
-            <w:r>
-              <w:t>Print de venda real</w:t>
-            </w:r>
-          </w:p>
-        </w:tc>
-        <w:tc>
-          <w:tcPr>
-            <w:tcW w:type="dxa" w:w="2880"/>
+            <w:tcW w:type="dxa" w:w="4320"/>
           </w:tcPr>
           <w:p>
             <w:r>
@@ -3065,27 +2607,17 @@
       <w:tr>
         <w:tc>
           <w:tcPr>
-            <w:tcW w:type="dxa" w:w="2880"/>
+            <w:tcW w:type="dxa" w:w="4320"/>
           </w:tcPr>
           <w:p>
             <w:r>
-              <w:t>38–48s</w:t>
+              <w:t>Você à câmera</w:t>
             </w:r>
           </w:p>
         </w:tc>
         <w:tc>
           <w:tcPr>
-            <w:tcW w:type="dxa" w:w="2880"/>
-          </w:tcPr>
-          <w:p>
-            <w:r>
-              <w:t>Você à câmera</w:t>
-            </w:r>
-          </w:p>
-        </w:tc>
-        <w:tc>
-          <w:tcPr>
-            <w:tcW w:type="dxa" w:w="2880"/>
+            <w:tcW w:type="dxa" w:w="4320"/>
           </w:tcPr>
           <w:p>
             <w:r>
@@ -3121,7 +2653,7 @@
         <w:pStyle w:val="Heading2"/>
       </w:pPr>
       <w:r>
-        <w:t>Roteiro 8: Presente de chá de bebê e Dia das Mães (Reels, 35 a 45s)</w:t>
+        <w:t>Roteiro 8: Presente de chá de bebê e Dia das Mães</w:t>
       </w:r>
     </w:p>
     <w:p>
@@ -3181,40 +2713,26 @@
         <w:tblLook w:firstColumn="1" w:firstRow="1" w:lastColumn="0" w:lastRow="0" w:noHBand="0" w:noVBand="1" w:val="04A0"/>
       </w:tblPr>
       <w:tblGrid>
-        <w:gridCol w:w="2880"/>
-        <w:gridCol w:w="2880"/>
-        <w:gridCol w:w="2880"/>
+        <w:gridCol w:w="4320"/>
+        <w:gridCol w:w="4320"/>
       </w:tblGrid>
       <w:tr>
         <w:tc>
           <w:tcPr>
-            <w:tcW w:type="dxa" w:w="2880"/>
+            <w:tcW w:type="dxa" w:w="4320"/>
           </w:tcPr>
           <w:p>
             <w:r>
               <w:rPr>
                 <w:b/>
               </w:rPr>
-              <w:t>Tempo</w:t>
+              <w:t>Visual</w:t>
             </w:r>
           </w:p>
         </w:tc>
         <w:tc>
           <w:tcPr>
-            <w:tcW w:type="dxa" w:w="2880"/>
-          </w:tcPr>
-          <w:p>
-            <w:r>
-              <w:rPr>
-                <w:b/>
-              </w:rPr>
-              <w:t>Visual</w:t>
-            </w:r>
-          </w:p>
-        </w:tc>
-        <w:tc>
-          <w:tcPr>
-            <w:tcW w:type="dxa" w:w="2880"/>
+            <w:tcW w:type="dxa" w:w="4320"/>
           </w:tcPr>
           <w:p>
             <w:r>
@@ -3229,27 +2747,17 @@
       <w:tr>
         <w:tc>
           <w:tcPr>
-            <w:tcW w:type="dxa" w:w="2880"/>
+            <w:tcW w:type="dxa" w:w="4320"/>
           </w:tcPr>
           <w:p>
             <w:r>
-              <w:t>0–4s</w:t>
+              <w:t>Embrulho de presente com a Mimo</w:t>
             </w:r>
           </w:p>
         </w:tc>
         <w:tc>
           <w:tcPr>
-            <w:tcW w:type="dxa" w:w="2880"/>
-          </w:tcPr>
-          <w:p>
-            <w:r>
-              <w:t>Embrulho de presente com a Mimo</w:t>
-            </w:r>
-          </w:p>
-        </w:tc>
-        <w:tc>
-          <w:tcPr>
-            <w:tcW w:type="dxa" w:w="2880"/>
+            <w:tcW w:type="dxa" w:w="4320"/>
           </w:tcPr>
           <w:p>
             <w:r>
@@ -3261,27 +2769,17 @@
       <w:tr>
         <w:tc>
           <w:tcPr>
-            <w:tcW w:type="dxa" w:w="2880"/>
+            <w:tcW w:type="dxa" w:w="4320"/>
           </w:tcPr>
           <w:p>
             <w:r>
-              <w:t>4–16s</w:t>
+              <w:t>Mostre a peça com laço, embalada</w:t>
             </w:r>
           </w:p>
         </w:tc>
         <w:tc>
           <w:tcPr>
-            <w:tcW w:type="dxa" w:w="2880"/>
-          </w:tcPr>
-          <w:p>
-            <w:r>
-              <w:t>Mostre a peça com laço, embalada</w:t>
-            </w:r>
-          </w:p>
-        </w:tc>
-        <w:tc>
-          <w:tcPr>
-            <w:tcW w:type="dxa" w:w="2880"/>
+            <w:tcW w:type="dxa" w:w="4320"/>
           </w:tcPr>
           <w:p>
             <w:r>
@@ -3293,27 +2791,17 @@
       <w:tr>
         <w:tc>
           <w:tcPr>
-            <w:tcW w:type="dxa" w:w="2880"/>
+            <w:tcW w:type="dxa" w:w="4320"/>
           </w:tcPr>
           <w:p>
             <w:r>
-              <w:t>16–28s</w:t>
+              <w:t>Mostre a embalagem e etiqueta</w:t>
             </w:r>
           </w:p>
         </w:tc>
         <w:tc>
           <w:tcPr>
-            <w:tcW w:type="dxa" w:w="2880"/>
-          </w:tcPr>
-          <w:p>
-            <w:r>
-              <w:t>Mostre a embalagem e etiqueta</w:t>
-            </w:r>
-          </w:p>
-        </w:tc>
-        <w:tc>
-          <w:tcPr>
-            <w:tcW w:type="dxa" w:w="2880"/>
+            <w:tcW w:type="dxa" w:w="4320"/>
           </w:tcPr>
           <w:p>
             <w:r>
@@ -3334,27 +2822,17 @@
       <w:tr>
         <w:tc>
           <w:tcPr>
-            <w:tcW w:type="dxa" w:w="2880"/>
+            <w:tcW w:type="dxa" w:w="4320"/>
           </w:tcPr>
           <w:p>
             <w:r>
-              <w:t>28–40s</w:t>
+              <w:t>Você à câmera</w:t>
             </w:r>
           </w:p>
         </w:tc>
         <w:tc>
           <w:tcPr>
-            <w:tcW w:type="dxa" w:w="2880"/>
-          </w:tcPr>
-          <w:p>
-            <w:r>
-              <w:t>Você à câmera</w:t>
-            </w:r>
-          </w:p>
-        </w:tc>
-        <w:tc>
-          <w:tcPr>
-            <w:tcW w:type="dxa" w:w="2880"/>
+            <w:tcW w:type="dxa" w:w="4320"/>
           </w:tcPr>
           <w:p>
             <w:r>
@@ -3378,7 +2856,7 @@
         <w:pStyle w:val="Heading2"/>
       </w:pPr>
       <w:r>
-        <w:t>Roteiro 9: "Fature 3x o valor que você investiu" (Reels, 40 a 50s)</w:t>
+        <w:t>Roteiro 9: "Fature 3x o valor que você investiu"</w:t>
       </w:r>
     </w:p>
     <w:p>
@@ -3467,40 +2945,26 @@
         <w:tblLook w:firstColumn="1" w:firstRow="1" w:lastColumn="0" w:lastRow="0" w:noHBand="0" w:noVBand="1" w:val="04A0"/>
       </w:tblPr>
       <w:tblGrid>
-        <w:gridCol w:w="2880"/>
-        <w:gridCol w:w="2880"/>
-        <w:gridCol w:w="2880"/>
+        <w:gridCol w:w="4320"/>
+        <w:gridCol w:w="4320"/>
       </w:tblGrid>
       <w:tr>
         <w:tc>
           <w:tcPr>
-            <w:tcW w:type="dxa" w:w="2880"/>
+            <w:tcW w:type="dxa" w:w="4320"/>
           </w:tcPr>
           <w:p>
             <w:r>
               <w:rPr>
                 <w:b/>
               </w:rPr>
-              <w:t>Tempo</w:t>
+              <w:t>Visual</w:t>
             </w:r>
           </w:p>
         </w:tc>
         <w:tc>
           <w:tcPr>
-            <w:tcW w:type="dxa" w:w="2880"/>
-          </w:tcPr>
-          <w:p>
-            <w:r>
-              <w:rPr>
-                <w:b/>
-              </w:rPr>
-              <w:t>Visual</w:t>
-            </w:r>
-          </w:p>
-        </w:tc>
-        <w:tc>
-          <w:tcPr>
-            <w:tcW w:type="dxa" w:w="2880"/>
+            <w:tcW w:type="dxa" w:w="4320"/>
           </w:tcPr>
           <w:p>
             <w:r>
@@ -3515,27 +2979,17 @@
       <w:tr>
         <w:tc>
           <w:tcPr>
-            <w:tcW w:type="dxa" w:w="2880"/>
+            <w:tcW w:type="dxa" w:w="4320"/>
           </w:tcPr>
           <w:p>
             <w:r>
-              <w:t>0–4s</w:t>
+              <w:t>Você no ateliê</w:t>
             </w:r>
           </w:p>
         </w:tc>
         <w:tc>
           <w:tcPr>
-            <w:tcW w:type="dxa" w:w="2880"/>
-          </w:tcPr>
-          <w:p>
-            <w:r>
-              <w:t>Você no ateliê</w:t>
-            </w:r>
-          </w:p>
-        </w:tc>
-        <w:tc>
-          <w:tcPr>
-            <w:tcW w:type="dxa" w:w="2880"/>
+            <w:tcW w:type="dxa" w:w="4320"/>
           </w:tcPr>
           <w:p>
             <w:r>
@@ -3547,27 +3001,17 @@
       <w:tr>
         <w:tc>
           <w:tcPr>
-            <w:tcW w:type="dxa" w:w="2880"/>
+            <w:tcW w:type="dxa" w:w="4320"/>
           </w:tcPr>
           <w:p>
             <w:r>
-              <w:t>4–14s</w:t>
+              <w:t>Mostre tela com a conta ou papel</w:t>
             </w:r>
           </w:p>
         </w:tc>
         <w:tc>
           <w:tcPr>
-            <w:tcW w:type="dxa" w:w="2880"/>
-          </w:tcPr>
-          <w:p>
-            <w:r>
-              <w:t>Mostre tela com a conta ou papel</w:t>
-            </w:r>
-          </w:p>
-        </w:tc>
-        <w:tc>
-          <w:tcPr>
-            <w:tcW w:type="dxa" w:w="2880"/>
+            <w:tcW w:type="dxa" w:w="4320"/>
           </w:tcPr>
           <w:p>
             <w:r>
@@ -3615,27 +3059,17 @@
       <w:tr>
         <w:tc>
           <w:tcPr>
-            <w:tcW w:type="dxa" w:w="2880"/>
+            <w:tcW w:type="dxa" w:w="4320"/>
           </w:tcPr>
           <w:p>
             <w:r>
-              <w:t>14–26s</w:t>
+              <w:t>Mostre a peça e a etiqueta de preço</w:t>
             </w:r>
           </w:p>
         </w:tc>
         <w:tc>
           <w:tcPr>
-            <w:tcW w:type="dxa" w:w="2880"/>
-          </w:tcPr>
-          <w:p>
-            <w:r>
-              <w:t>Mostre a peça e a etiqueta de preço</w:t>
-            </w:r>
-          </w:p>
-        </w:tc>
-        <w:tc>
-          <w:tcPr>
-            <w:tcW w:type="dxa" w:w="2880"/>
+            <w:tcW w:type="dxa" w:w="4320"/>
           </w:tcPr>
           <w:p>
             <w:r>
@@ -3692,27 +3126,17 @@
       <w:tr>
         <w:tc>
           <w:tcPr>
-            <w:tcW w:type="dxa" w:w="2880"/>
+            <w:tcW w:type="dxa" w:w="4320"/>
           </w:tcPr>
           <w:p>
             <w:r>
-              <w:t>26–38s</w:t>
+              <w:t>Print real de aluna</w:t>
             </w:r>
           </w:p>
         </w:tc>
         <w:tc>
           <w:tcPr>
-            <w:tcW w:type="dxa" w:w="2880"/>
-          </w:tcPr>
-          <w:p>
-            <w:r>
-              <w:t>Print real de aluna</w:t>
-            </w:r>
-          </w:p>
-        </w:tc>
-        <w:tc>
-          <w:tcPr>
-            <w:tcW w:type="dxa" w:w="2880"/>
+            <w:tcW w:type="dxa" w:w="4320"/>
           </w:tcPr>
           <w:p>
             <w:r>
@@ -3748,27 +3172,17 @@
       <w:tr>
         <w:tc>
           <w:tcPr>
-            <w:tcW w:type="dxa" w:w="2880"/>
+            <w:tcW w:type="dxa" w:w="4320"/>
           </w:tcPr>
           <w:p>
             <w:r>
-              <w:t>38–48s</w:t>
+              <w:t>Você à câmera</w:t>
             </w:r>
           </w:p>
         </w:tc>
         <w:tc>
           <w:tcPr>
-            <w:tcW w:type="dxa" w:w="2880"/>
-          </w:tcPr>
-          <w:p>
-            <w:r>
-              <w:t>Você à câmera</w:t>
-            </w:r>
-          </w:p>
-        </w:tc>
-        <w:tc>
-          <w:tcPr>
-            <w:tcW w:type="dxa" w:w="2880"/>
+            <w:tcW w:type="dxa" w:w="4320"/>
           </w:tcPr>
           <w:p>
             <w:r>
@@ -3804,7 +3218,7 @@
         <w:pStyle w:val="Heading2"/>
       </w:pPr>
       <w:r>
-        <w:t>Roteiro 10: "Lucre até [80]% por peça" (Reels, 35 a 45s)</w:t>
+        <w:t>Roteiro 10: "Lucre até [80]% por peça"</w:t>
       </w:r>
     </w:p>
     <w:p>
@@ -3855,40 +3269,26 @@
         <w:tblLook w:firstColumn="1" w:firstRow="1" w:lastColumn="0" w:lastRow="0" w:noHBand="0" w:noVBand="1" w:val="04A0"/>
       </w:tblPr>
       <w:tblGrid>
-        <w:gridCol w:w="2880"/>
-        <w:gridCol w:w="2880"/>
-        <w:gridCol w:w="2880"/>
+        <w:gridCol w:w="4320"/>
+        <w:gridCol w:w="4320"/>
       </w:tblGrid>
       <w:tr>
         <w:tc>
           <w:tcPr>
-            <w:tcW w:type="dxa" w:w="2880"/>
+            <w:tcW w:type="dxa" w:w="4320"/>
           </w:tcPr>
           <w:p>
             <w:r>
               <w:rPr>
                 <w:b/>
               </w:rPr>
-              <w:t>Tempo</w:t>
+              <w:t>Visual</w:t>
             </w:r>
           </w:p>
         </w:tc>
         <w:tc>
           <w:tcPr>
-            <w:tcW w:type="dxa" w:w="2880"/>
-          </w:tcPr>
-          <w:p>
-            <w:r>
-              <w:rPr>
-                <w:b/>
-              </w:rPr>
-              <w:t>Visual</w:t>
-            </w:r>
-          </w:p>
-        </w:tc>
-        <w:tc>
-          <w:tcPr>
-            <w:tcW w:type="dxa" w:w="2880"/>
+            <w:tcW w:type="dxa" w:w="4320"/>
           </w:tcPr>
           <w:p>
             <w:r>
@@ -3903,27 +3303,17 @@
       <w:tr>
         <w:tc>
           <w:tcPr>
-            <w:tcW w:type="dxa" w:w="2880"/>
+            <w:tcW w:type="dxa" w:w="4320"/>
           </w:tcPr>
           <w:p>
             <w:r>
-              <w:t>0–4s</w:t>
+              <w:t>Você segurando a necessaire</w:t>
             </w:r>
           </w:p>
         </w:tc>
         <w:tc>
           <w:tcPr>
-            <w:tcW w:type="dxa" w:w="2880"/>
-          </w:tcPr>
-          <w:p>
-            <w:r>
-              <w:t>Você segurando a necessaire</w:t>
-            </w:r>
-          </w:p>
-        </w:tc>
-        <w:tc>
-          <w:tcPr>
-            <w:tcW w:type="dxa" w:w="2880"/>
+            <w:tcW w:type="dxa" w:w="4320"/>
           </w:tcPr>
           <w:p>
             <w:r>
@@ -3935,27 +3325,17 @@
       <w:tr>
         <w:tc>
           <w:tcPr>
-            <w:tcW w:type="dxa" w:w="2880"/>
+            <w:tcW w:type="dxa" w:w="4320"/>
           </w:tcPr>
           <w:p>
             <w:r>
-              <w:t>4–16s</w:t>
+              <w:t>Escreva na tela a conta</w:t>
             </w:r>
           </w:p>
         </w:tc>
         <w:tc>
           <w:tcPr>
-            <w:tcW w:type="dxa" w:w="2880"/>
-          </w:tcPr>
-          <w:p>
-            <w:r>
-              <w:t>Escreva na tela a conta</w:t>
-            </w:r>
-          </w:p>
-        </w:tc>
-        <w:tc>
-          <w:tcPr>
-            <w:tcW w:type="dxa" w:w="2880"/>
+            <w:tcW w:type="dxa" w:w="4320"/>
           </w:tcPr>
           <w:p>
             <w:r>
@@ -3994,27 +3374,17 @@
       <w:tr>
         <w:tc>
           <w:tcPr>
-            <w:tcW w:type="dxa" w:w="2880"/>
+            <w:tcW w:type="dxa" w:w="4320"/>
           </w:tcPr>
           <w:p>
             <w:r>
-              <w:t>16–28s</w:t>
+              <w:t>Mostre outra peça de ateliê de margem baixa</w:t>
             </w:r>
           </w:p>
         </w:tc>
         <w:tc>
           <w:tcPr>
-            <w:tcW w:type="dxa" w:w="2880"/>
-          </w:tcPr>
-          <w:p>
-            <w:r>
-              <w:t>Mostre outra peça de ateliê de margem baixa</w:t>
-            </w:r>
-          </w:p>
-        </w:tc>
-        <w:tc>
-          <w:tcPr>
-            <w:tcW w:type="dxa" w:w="2880"/>
+            <w:tcW w:type="dxa" w:w="4320"/>
           </w:tcPr>
           <w:p>
             <w:r>
@@ -4035,27 +3405,17 @@
       <w:tr>
         <w:tc>
           <w:tcPr>
-            <w:tcW w:type="dxa" w:w="2880"/>
+            <w:tcW w:type="dxa" w:w="4320"/>
           </w:tcPr>
           <w:p>
             <w:r>
-              <w:t>28–40s</w:t>
+              <w:t>Você à câmera</w:t>
             </w:r>
           </w:p>
         </w:tc>
         <w:tc>
           <w:tcPr>
-            <w:tcW w:type="dxa" w:w="2880"/>
-          </w:tcPr>
-          <w:p>
-            <w:r>
-              <w:t>Você à câmera</w:t>
-            </w:r>
-          </w:p>
-        </w:tc>
-        <w:tc>
-          <w:tcPr>
-            <w:tcW w:type="dxa" w:w="2880"/>
+            <w:tcW w:type="dxa" w:w="4320"/>
           </w:tcPr>
           <w:p>
             <w:r>
@@ -4082,7 +3442,7 @@
         <w:pStyle w:val="Heading2"/>
       </w:pPr>
       <w:r>
-        <w:t>Roteiro 11: "Venda [8] unidades no primeiro mês" (Reels, 40 a 50s)</w:t>
+        <w:t>Roteiro 11: "Venda [8] unidades no primeiro mês"</w:t>
       </w:r>
     </w:p>
     <w:p>
@@ -4133,40 +3493,26 @@
         <w:tblLook w:firstColumn="1" w:firstRow="1" w:lastColumn="0" w:lastRow="0" w:noHBand="0" w:noVBand="1" w:val="04A0"/>
       </w:tblPr>
       <w:tblGrid>
-        <w:gridCol w:w="2880"/>
-        <w:gridCol w:w="2880"/>
-        <w:gridCol w:w="2880"/>
+        <w:gridCol w:w="4320"/>
+        <w:gridCol w:w="4320"/>
       </w:tblGrid>
       <w:tr>
         <w:tc>
           <w:tcPr>
-            <w:tcW w:type="dxa" w:w="2880"/>
+            <w:tcW w:type="dxa" w:w="4320"/>
           </w:tcPr>
           <w:p>
             <w:r>
               <w:rPr>
                 <w:b/>
               </w:rPr>
-              <w:t>Tempo</w:t>
+              <w:t>Visual</w:t>
             </w:r>
           </w:p>
         </w:tc>
         <w:tc>
           <w:tcPr>
-            <w:tcW w:type="dxa" w:w="2880"/>
-          </w:tcPr>
-          <w:p>
-            <w:r>
-              <w:rPr>
-                <w:b/>
-              </w:rPr>
-              <w:t>Visual</w:t>
-            </w:r>
-          </w:p>
-        </w:tc>
-        <w:tc>
-          <w:tcPr>
-            <w:tcW w:type="dxa" w:w="2880"/>
+            <w:tcW w:type="dxa" w:w="4320"/>
           </w:tcPr>
           <w:p>
             <w:r>
@@ -4181,27 +3527,17 @@
       <w:tr>
         <w:tc>
           <w:tcPr>
-            <w:tcW w:type="dxa" w:w="2880"/>
+            <w:tcW w:type="dxa" w:w="4320"/>
           </w:tcPr>
           <w:p>
             <w:r>
-              <w:t>0–4s</w:t>
+              <w:t>Calendário ou lista com 8 tracinhos</w:t>
             </w:r>
           </w:p>
         </w:tc>
         <w:tc>
           <w:tcPr>
-            <w:tcW w:type="dxa" w:w="2880"/>
-          </w:tcPr>
-          <w:p>
-            <w:r>
-              <w:t>Calendário ou lista com 8 tracinhos</w:t>
-            </w:r>
-          </w:p>
-        </w:tc>
-        <w:tc>
-          <w:tcPr>
-            <w:tcW w:type="dxa" w:w="2880"/>
+            <w:tcW w:type="dxa" w:w="4320"/>
           </w:tcPr>
           <w:p>
             <w:r>
@@ -4213,27 +3549,17 @@
       <w:tr>
         <w:tc>
           <w:tcPr>
-            <w:tcW w:type="dxa" w:w="2880"/>
+            <w:tcW w:type="dxa" w:w="4320"/>
           </w:tcPr>
           <w:p>
             <w:r>
-              <w:t>4–16s</w:t>
+              <w:t>Mostre o plano na tela</w:t>
             </w:r>
           </w:p>
         </w:tc>
         <w:tc>
           <w:tcPr>
-            <w:tcW w:type="dxa" w:w="2880"/>
-          </w:tcPr>
-          <w:p>
-            <w:r>
-              <w:t>Mostre o plano na tela</w:t>
-            </w:r>
-          </w:p>
-        </w:tc>
-        <w:tc>
-          <w:tcPr>
-            <w:tcW w:type="dxa" w:w="2880"/>
+            <w:tcW w:type="dxa" w:w="4320"/>
           </w:tcPr>
           <w:p>
             <w:r>
@@ -4272,27 +3598,17 @@
       <w:tr>
         <w:tc>
           <w:tcPr>
-            <w:tcW w:type="dxa" w:w="2880"/>
+            <w:tcW w:type="dxa" w:w="4320"/>
           </w:tcPr>
           <w:p>
             <w:r>
-              <w:t>16–28s</w:t>
+              <w:t>Conta na tela</w:t>
             </w:r>
           </w:p>
         </w:tc>
         <w:tc>
           <w:tcPr>
-            <w:tcW w:type="dxa" w:w="2880"/>
-          </w:tcPr>
-          <w:p>
-            <w:r>
-              <w:t>Conta na tela</w:t>
-            </w:r>
-          </w:p>
-        </w:tc>
-        <w:tc>
-          <w:tcPr>
-            <w:tcW w:type="dxa" w:w="2880"/>
+            <w:tcW w:type="dxa" w:w="4320"/>
           </w:tcPr>
           <w:p>
             <w:r>
@@ -4322,27 +3638,17 @@
       <w:tr>
         <w:tc>
           <w:tcPr>
-            <w:tcW w:type="dxa" w:w="2880"/>
+            <w:tcW w:type="dxa" w:w="4320"/>
           </w:tcPr>
           <w:p>
             <w:r>
-              <w:t>28–40s</w:t>
+              <w:t>Print de aluna</w:t>
             </w:r>
           </w:p>
         </w:tc>
         <w:tc>
           <w:tcPr>
-            <w:tcW w:type="dxa" w:w="2880"/>
-          </w:tcPr>
-          <w:p>
-            <w:r>
-              <w:t>Print de aluna</w:t>
-            </w:r>
-          </w:p>
-        </w:tc>
-        <w:tc>
-          <w:tcPr>
-            <w:tcW w:type="dxa" w:w="2880"/>
+            <w:tcW w:type="dxa" w:w="4320"/>
           </w:tcPr>
           <w:p>
             <w:r>
@@ -4378,27 +3684,17 @@
       <w:tr>
         <w:tc>
           <w:tcPr>
-            <w:tcW w:type="dxa" w:w="2880"/>
+            <w:tcW w:type="dxa" w:w="4320"/>
           </w:tcPr>
           <w:p>
             <w:r>
-              <w:t>40–48s</w:t>
+              <w:t>Você à câmera</w:t>
             </w:r>
           </w:p>
         </w:tc>
         <w:tc>
           <w:tcPr>
-            <w:tcW w:type="dxa" w:w="2880"/>
-          </w:tcPr>
-          <w:p>
-            <w:r>
-              <w:t>Você à câmera</w:t>
-            </w:r>
-          </w:p>
-        </w:tc>
-        <w:tc>
-          <w:tcPr>
-            <w:tcW w:type="dxa" w:w="2880"/>
+            <w:tcW w:type="dxa" w:w="4320"/>
           </w:tcPr>
           <w:p>
             <w:r>
@@ -4414,7 +3710,7 @@
         <w:pStyle w:val="Heading2"/>
       </w:pPr>
       <w:r>
-        <w:t>Roteiro 12: Fim de ano, faturar mais no ateliê (Reels, 45 a 55s)</w:t>
+        <w:t>Roteiro 12: Fim de ano, faturar mais no ateliê</w:t>
       </w:r>
     </w:p>
     <w:p>
@@ -4465,40 +3761,26 @@
         <w:tblLook w:firstColumn="1" w:firstRow="1" w:lastColumn="0" w:lastRow="0" w:noHBand="0" w:noVBand="1" w:val="04A0"/>
       </w:tblPr>
       <w:tblGrid>
-        <w:gridCol w:w="2880"/>
-        <w:gridCol w:w="2880"/>
-        <w:gridCol w:w="2880"/>
+        <w:gridCol w:w="4320"/>
+        <w:gridCol w:w="4320"/>
       </w:tblGrid>
       <w:tr>
         <w:tc>
           <w:tcPr>
-            <w:tcW w:type="dxa" w:w="2880"/>
+            <w:tcW w:type="dxa" w:w="4320"/>
           </w:tcPr>
           <w:p>
             <w:r>
               <w:rPr>
                 <w:b/>
               </w:rPr>
-              <w:t>Tempo</w:t>
+              <w:t>Visual</w:t>
             </w:r>
           </w:p>
         </w:tc>
         <w:tc>
           <w:tcPr>
-            <w:tcW w:type="dxa" w:w="2880"/>
-          </w:tcPr>
-          <w:p>
-            <w:r>
-              <w:rPr>
-                <w:b/>
-              </w:rPr>
-              <w:t>Visual</w:t>
-            </w:r>
-          </w:p>
-        </w:tc>
-        <w:tc>
-          <w:tcPr>
-            <w:tcW w:type="dxa" w:w="2880"/>
+            <w:tcW w:type="dxa" w:w="4320"/>
           </w:tcPr>
           <w:p>
             <w:r>
@@ -4513,27 +3795,17 @@
       <w:tr>
         <w:tc>
           <w:tcPr>
-            <w:tcW w:type="dxa" w:w="2880"/>
+            <w:tcW w:type="dxa" w:w="4320"/>
           </w:tcPr>
           <w:p>
             <w:r>
-              <w:t>0–4s</w:t>
+              <w:t>Ateliê com decoração de fim de ano</w:t>
             </w:r>
           </w:p>
         </w:tc>
         <w:tc>
           <w:tcPr>
-            <w:tcW w:type="dxa" w:w="2880"/>
-          </w:tcPr>
-          <w:p>
-            <w:r>
-              <w:t>Ateliê com decoração de fim de ano</w:t>
-            </w:r>
-          </w:p>
-        </w:tc>
-        <w:tc>
-          <w:tcPr>
-            <w:tcW w:type="dxa" w:w="2880"/>
+            <w:tcW w:type="dxa" w:w="4320"/>
           </w:tcPr>
           <w:p>
             <w:r>
@@ -4545,27 +3817,17 @@
       <w:tr>
         <w:tc>
           <w:tcPr>
-            <w:tcW w:type="dxa" w:w="2880"/>
+            <w:tcW w:type="dxa" w:w="4320"/>
           </w:tcPr>
           <w:p>
             <w:r>
-              <w:t>4–16s</w:t>
+              <w:t>Você à câmera</w:t>
             </w:r>
           </w:p>
         </w:tc>
         <w:tc>
           <w:tcPr>
-            <w:tcW w:type="dxa" w:w="2880"/>
-          </w:tcPr>
-          <w:p>
-            <w:r>
-              <w:t>Você à câmera</w:t>
-            </w:r>
-          </w:p>
-        </w:tc>
-        <w:tc>
-          <w:tcPr>
-            <w:tcW w:type="dxa" w:w="2880"/>
+            <w:tcW w:type="dxa" w:w="4320"/>
           </w:tcPr>
           <w:p>
             <w:r>
@@ -4586,36 +3848,26 @@
       <w:tr>
         <w:tc>
           <w:tcPr>
-            <w:tcW w:type="dxa" w:w="2880"/>
+            <w:tcW w:type="dxa" w:w="4320"/>
           </w:tcPr>
           <w:p>
             <w:r>
-              <w:t>16–30s</w:t>
+              <w:t xml:space="preserve">Mostre a </w:t>
+            </w:r>
+            <w:r>
+              <w:rPr>
+                <w:b/>
+              </w:rPr>
+              <w:t>Necessaire Make</w:t>
+            </w:r>
+            <w:r>
+              <w:t xml:space="preserve"> embalada para presente</w:t>
             </w:r>
           </w:p>
         </w:tc>
         <w:tc>
           <w:tcPr>
-            <w:tcW w:type="dxa" w:w="2880"/>
-          </w:tcPr>
-          <w:p>
-            <w:r>
-              <w:t xml:space="preserve">Mostre a </w:t>
-            </w:r>
-            <w:r>
-              <w:rPr>
-                <w:b/>
-              </w:rPr>
-              <w:t>Necessaire Make</w:t>
-            </w:r>
-            <w:r>
-              <w:t xml:space="preserve"> embalada para presente</w:t>
-            </w:r>
-          </w:p>
-        </w:tc>
-        <w:tc>
-          <w:tcPr>
-            <w:tcW w:type="dxa" w:w="2880"/>
+            <w:tcW w:type="dxa" w:w="4320"/>
           </w:tcPr>
           <w:p>
             <w:r>
@@ -4645,27 +3897,17 @@
       <w:tr>
         <w:tc>
           <w:tcPr>
-            <w:tcW w:type="dxa" w:w="2880"/>
+            <w:tcW w:type="dxa" w:w="4320"/>
           </w:tcPr>
           <w:p>
             <w:r>
-              <w:t>30–44s</w:t>
+              <w:t>Você à câmera</w:t>
             </w:r>
           </w:p>
         </w:tc>
         <w:tc>
           <w:tcPr>
-            <w:tcW w:type="dxa" w:w="2880"/>
-          </w:tcPr>
-          <w:p>
-            <w:r>
-              <w:t>Você à câmera</w:t>
-            </w:r>
-          </w:p>
-        </w:tc>
-        <w:tc>
-          <w:tcPr>
-            <w:tcW w:type="dxa" w:w="2880"/>
+            <w:tcW w:type="dxa" w:w="4320"/>
           </w:tcPr>
           <w:p>
             <w:r>
@@ -4686,27 +3928,17 @@
       <w:tr>
         <w:tc>
           <w:tcPr>
-            <w:tcW w:type="dxa" w:w="2880"/>
+            <w:tcW w:type="dxa" w:w="4320"/>
           </w:tcPr>
           <w:p>
             <w:r>
-              <w:t>44–54s</w:t>
+              <w:t>Você à câmera</w:t>
             </w:r>
           </w:p>
         </w:tc>
         <w:tc>
           <w:tcPr>
-            <w:tcW w:type="dxa" w:w="2880"/>
-          </w:tcPr>
-          <w:p>
-            <w:r>
-              <w:t>Você à câmera</w:t>
-            </w:r>
-          </w:p>
-        </w:tc>
-        <w:tc>
-          <w:tcPr>
-            <w:tcW w:type="dxa" w:w="2880"/>
+            <w:tcW w:type="dxa" w:w="4320"/>
           </w:tcPr>
           <w:p>
             <w:r>
@@ -4722,7 +3954,7 @@
         <w:pStyle w:val="Heading2"/>
       </w:pPr>
       <w:r>
-        <w:t>Roteiro 13: Urgência de produção (Reels, 30 a 40s)</w:t>
+        <w:t>Roteiro 13: Urgência de produção</w:t>
       </w:r>
     </w:p>
     <w:p>
@@ -4782,40 +4014,26 @@
         <w:tblLook w:firstColumn="1" w:firstRow="1" w:lastColumn="0" w:lastRow="0" w:noHBand="0" w:noVBand="1" w:val="04A0"/>
       </w:tblPr>
       <w:tblGrid>
-        <w:gridCol w:w="2880"/>
-        <w:gridCol w:w="2880"/>
-        <w:gridCol w:w="2880"/>
+        <w:gridCol w:w="4320"/>
+        <w:gridCol w:w="4320"/>
       </w:tblGrid>
       <w:tr>
         <w:tc>
           <w:tcPr>
-            <w:tcW w:type="dxa" w:w="2880"/>
+            <w:tcW w:type="dxa" w:w="4320"/>
           </w:tcPr>
           <w:p>
             <w:r>
               <w:rPr>
                 <w:b/>
               </w:rPr>
-              <w:t>Tempo</w:t>
+              <w:t>Visual</w:t>
             </w:r>
           </w:p>
         </w:tc>
         <w:tc>
           <w:tcPr>
-            <w:tcW w:type="dxa" w:w="2880"/>
-          </w:tcPr>
-          <w:p>
-            <w:r>
-              <w:rPr>
-                <w:b/>
-              </w:rPr>
-              <w:t>Visual</w:t>
-            </w:r>
-          </w:p>
-        </w:tc>
-        <w:tc>
-          <w:tcPr>
-            <w:tcW w:type="dxa" w:w="2880"/>
+            <w:tcW w:type="dxa" w:w="4320"/>
           </w:tcPr>
           <w:p>
             <w:r>
@@ -4830,27 +4048,17 @@
       <w:tr>
         <w:tc>
           <w:tcPr>
-            <w:tcW w:type="dxa" w:w="2880"/>
+            <w:tcW w:type="dxa" w:w="4320"/>
           </w:tcPr>
           <w:p>
             <w:r>
-              <w:t>0–4s</w:t>
+              <w:t>Calendário com a data do Natal</w:t>
             </w:r>
           </w:p>
         </w:tc>
         <w:tc>
           <w:tcPr>
-            <w:tcW w:type="dxa" w:w="2880"/>
-          </w:tcPr>
-          <w:p>
-            <w:r>
-              <w:t>Calendário com a data do Natal</w:t>
-            </w:r>
-          </w:p>
-        </w:tc>
-        <w:tc>
-          <w:tcPr>
-            <w:tcW w:type="dxa" w:w="2880"/>
+            <w:tcW w:type="dxa" w:w="4320"/>
           </w:tcPr>
           <w:p>
             <w:r>
@@ -4862,27 +4070,17 @@
       <w:tr>
         <w:tc>
           <w:tcPr>
-            <w:tcW w:type="dxa" w:w="2880"/>
+            <w:tcW w:type="dxa" w:w="4320"/>
           </w:tcPr>
           <w:p>
             <w:r>
-              <w:t>4–16s</w:t>
+              <w:t>Conta na tela</w:t>
             </w:r>
           </w:p>
         </w:tc>
         <w:tc>
           <w:tcPr>
-            <w:tcW w:type="dxa" w:w="2880"/>
-          </w:tcPr>
-          <w:p>
-            <w:r>
-              <w:t>Conta na tela</w:t>
-            </w:r>
-          </w:p>
-        </w:tc>
-        <w:tc>
-          <w:tcPr>
-            <w:tcW w:type="dxa" w:w="2880"/>
+            <w:tcW w:type="dxa" w:w="4320"/>
           </w:tcPr>
           <w:p>
             <w:r>
@@ -4930,27 +4128,17 @@
       <w:tr>
         <w:tc>
           <w:tcPr>
-            <w:tcW w:type="dxa" w:w="2880"/>
+            <w:tcW w:type="dxa" w:w="4320"/>
           </w:tcPr>
           <w:p>
             <w:r>
-              <w:t>16–28s</w:t>
+              <w:t>Você à câmera</w:t>
             </w:r>
           </w:p>
         </w:tc>
         <w:tc>
           <w:tcPr>
-            <w:tcW w:type="dxa" w:w="2880"/>
-          </w:tcPr>
-          <w:p>
-            <w:r>
-              <w:t>Você à câmera</w:t>
-            </w:r>
-          </w:p>
-        </w:tc>
-        <w:tc>
-          <w:tcPr>
-            <w:tcW w:type="dxa" w:w="2880"/>
+            <w:tcW w:type="dxa" w:w="4320"/>
           </w:tcPr>
           <w:p>
             <w:r>
@@ -4971,27 +4159,17 @@
       <w:tr>
         <w:tc>
           <w:tcPr>
-            <w:tcW w:type="dxa" w:w="2880"/>
+            <w:tcW w:type="dxa" w:w="4320"/>
           </w:tcPr>
           <w:p>
             <w:r>
-              <w:t>28–38s</w:t>
+              <w:t>Você à câmera</w:t>
             </w:r>
           </w:p>
         </w:tc>
         <w:tc>
           <w:tcPr>
-            <w:tcW w:type="dxa" w:w="2880"/>
-          </w:tcPr>
-          <w:p>
-            <w:r>
-              <w:t>Você à câmera</w:t>
-            </w:r>
-          </w:p>
-        </w:tc>
-        <w:tc>
-          <w:tcPr>
-            <w:tcW w:type="dxa" w:w="2880"/>
+            <w:tcW w:type="dxa" w:w="4320"/>
           </w:tcPr>
           <w:p>
             <w:r>
@@ -5007,7 +4185,7 @@
         <w:pStyle w:val="Heading2"/>
       </w:pPr>
       <w:r>
-        <w:t>Roteiro 14: Kit presente (Necessaire + Mimo) (Reels, 40 a 50s)</w:t>
+        <w:t>Roteiro 14: Kit presente (Necessaire + Mimo)</w:t>
       </w:r>
     </w:p>
     <w:p>
@@ -5058,40 +4236,26 @@
         <w:tblLook w:firstColumn="1" w:firstRow="1" w:lastColumn="0" w:lastRow="0" w:noHBand="0" w:noVBand="1" w:val="04A0"/>
       </w:tblPr>
       <w:tblGrid>
-        <w:gridCol w:w="2880"/>
-        <w:gridCol w:w="2880"/>
-        <w:gridCol w:w="2880"/>
+        <w:gridCol w:w="4320"/>
+        <w:gridCol w:w="4320"/>
       </w:tblGrid>
       <w:tr>
         <w:tc>
           <w:tcPr>
-            <w:tcW w:type="dxa" w:w="2880"/>
+            <w:tcW w:type="dxa" w:w="4320"/>
           </w:tcPr>
           <w:p>
             <w:r>
               <w:rPr>
                 <w:b/>
               </w:rPr>
-              <w:t>Tempo</w:t>
+              <w:t>Visual</w:t>
             </w:r>
           </w:p>
         </w:tc>
         <w:tc>
           <w:tcPr>
-            <w:tcW w:type="dxa" w:w="2880"/>
-          </w:tcPr>
-          <w:p>
-            <w:r>
-              <w:rPr>
-                <w:b/>
-              </w:rPr>
-              <w:t>Visual</w:t>
-            </w:r>
-          </w:p>
-        </w:tc>
-        <w:tc>
-          <w:tcPr>
-            <w:tcW w:type="dxa" w:w="2880"/>
+            <w:tcW w:type="dxa" w:w="4320"/>
           </w:tcPr>
           <w:p>
             <w:r>
@@ -5106,27 +4270,17 @@
       <w:tr>
         <w:tc>
           <w:tcPr>
-            <w:tcW w:type="dxa" w:w="2880"/>
+            <w:tcW w:type="dxa" w:w="4320"/>
           </w:tcPr>
           <w:p>
             <w:r>
-              <w:t>0–4s</w:t>
+              <w:t>As duas peças lado a lado, embaladas</w:t>
             </w:r>
           </w:p>
         </w:tc>
         <w:tc>
           <w:tcPr>
-            <w:tcW w:type="dxa" w:w="2880"/>
-          </w:tcPr>
-          <w:p>
-            <w:r>
-              <w:t>As duas peças lado a lado, embaladas</w:t>
-            </w:r>
-          </w:p>
-        </w:tc>
-        <w:tc>
-          <w:tcPr>
-            <w:tcW w:type="dxa" w:w="2880"/>
+            <w:tcW w:type="dxa" w:w="4320"/>
           </w:tcPr>
           <w:p>
             <w:r>
@@ -5138,27 +4292,17 @@
       <w:tr>
         <w:tc>
           <w:tcPr>
-            <w:tcW w:type="dxa" w:w="2880"/>
+            <w:tcW w:type="dxa" w:w="4320"/>
           </w:tcPr>
           <w:p>
             <w:r>
-              <w:t>4–16s</w:t>
+              <w:t>Mostre cada uma</w:t>
             </w:r>
           </w:p>
         </w:tc>
         <w:tc>
           <w:tcPr>
-            <w:tcW w:type="dxa" w:w="2880"/>
-          </w:tcPr>
-          <w:p>
-            <w:r>
-              <w:t>Mostre cada uma</w:t>
-            </w:r>
-          </w:p>
-        </w:tc>
-        <w:tc>
-          <w:tcPr>
-            <w:tcW w:type="dxa" w:w="2880"/>
+            <w:tcW w:type="dxa" w:w="4320"/>
           </w:tcPr>
           <w:p>
             <w:r>
@@ -5215,27 +4359,17 @@
       <w:tr>
         <w:tc>
           <w:tcPr>
-            <w:tcW w:type="dxa" w:w="2880"/>
+            <w:tcW w:type="dxa" w:w="4320"/>
           </w:tcPr>
           <w:p>
             <w:r>
-              <w:t>16–30s</w:t>
+              <w:t>Você à câmera</w:t>
             </w:r>
           </w:p>
         </w:tc>
         <w:tc>
           <w:tcPr>
-            <w:tcW w:type="dxa" w:w="2880"/>
-          </w:tcPr>
-          <w:p>
-            <w:r>
-              <w:t>Você à câmera</w:t>
-            </w:r>
-          </w:p>
-        </w:tc>
-        <w:tc>
-          <w:tcPr>
-            <w:tcW w:type="dxa" w:w="2880"/>
+            <w:tcW w:type="dxa" w:w="4320"/>
           </w:tcPr>
           <w:p>
             <w:r>
@@ -5247,27 +4381,17 @@
       <w:tr>
         <w:tc>
           <w:tcPr>
-            <w:tcW w:type="dxa" w:w="2880"/>
+            <w:tcW w:type="dxa" w:w="4320"/>
           </w:tcPr>
           <w:p>
             <w:r>
-              <w:t>30–42s</w:t>
+              <w:t>Você à câmera</w:t>
             </w:r>
           </w:p>
         </w:tc>
         <w:tc>
           <w:tcPr>
-            <w:tcW w:type="dxa" w:w="2880"/>
-          </w:tcPr>
-          <w:p>
-            <w:r>
-              <w:t>Você à câmera</w:t>
-            </w:r>
-          </w:p>
-        </w:tc>
-        <w:tc>
-          <w:tcPr>
-            <w:tcW w:type="dxa" w:w="2880"/>
+            <w:tcW w:type="dxa" w:w="4320"/>
           </w:tcPr>
           <w:p>
             <w:r>
@@ -5288,27 +4412,17 @@
       <w:tr>
         <w:tc>
           <w:tcPr>
-            <w:tcW w:type="dxa" w:w="2880"/>
+            <w:tcW w:type="dxa" w:w="4320"/>
           </w:tcPr>
           <w:p>
             <w:r>
-              <w:t>42–50s</w:t>
+              <w:t>Você à câmera</w:t>
             </w:r>
           </w:p>
         </w:tc>
         <w:tc>
           <w:tcPr>
-            <w:tcW w:type="dxa" w:w="2880"/>
-          </w:tcPr>
-          <w:p>
-            <w:r>
-              <w:t>Você à câmera</w:t>
-            </w:r>
-          </w:p>
-        </w:tc>
-        <w:tc>
-          <w:tcPr>
-            <w:tcW w:type="dxa" w:w="2880"/>
+            <w:tcW w:type="dxa" w:w="4320"/>
           </w:tcPr>
           <w:p>
             <w:r>
@@ -5324,7 +4438,7 @@
         <w:pStyle w:val="Heading2"/>
       </w:pPr>
       <w:r>
-        <w:t>Roteiro 15: Peça parada no estoque (Reels, 40 a 50s)</w:t>
+        <w:t>Roteiro 15: Peça parada no estoque</w:t>
       </w:r>
     </w:p>
     <w:p>
@@ -5375,40 +4489,26 @@
         <w:tblLook w:firstColumn="1" w:firstRow="1" w:lastColumn="0" w:lastRow="0" w:noHBand="0" w:noVBand="1" w:val="04A0"/>
       </w:tblPr>
       <w:tblGrid>
-        <w:gridCol w:w="2880"/>
-        <w:gridCol w:w="2880"/>
-        <w:gridCol w:w="2880"/>
+        <w:gridCol w:w="4320"/>
+        <w:gridCol w:w="4320"/>
       </w:tblGrid>
       <w:tr>
         <w:tc>
           <w:tcPr>
-            <w:tcW w:type="dxa" w:w="2880"/>
+            <w:tcW w:type="dxa" w:w="4320"/>
           </w:tcPr>
           <w:p>
             <w:r>
               <w:rPr>
                 <w:b/>
               </w:rPr>
-              <w:t>Tempo</w:t>
+              <w:t>Visual</w:t>
             </w:r>
           </w:p>
         </w:tc>
         <w:tc>
           <w:tcPr>
-            <w:tcW w:type="dxa" w:w="2880"/>
-          </w:tcPr>
-          <w:p>
-            <w:r>
-              <w:rPr>
-                <w:b/>
-              </w:rPr>
-              <w:t>Visual</w:t>
-            </w:r>
-          </w:p>
-        </w:tc>
-        <w:tc>
-          <w:tcPr>
-            <w:tcW w:type="dxa" w:w="2880"/>
+            <w:tcW w:type="dxa" w:w="4320"/>
           </w:tcPr>
           <w:p>
             <w:r>
@@ -5423,27 +4523,17 @@
       <w:tr>
         <w:tc>
           <w:tcPr>
-            <w:tcW w:type="dxa" w:w="2880"/>
+            <w:tcW w:type="dxa" w:w="4320"/>
           </w:tcPr>
           <w:p>
             <w:r>
-              <w:t>0–4s</w:t>
+              <w:t>Prateleira com peças paradas</w:t>
             </w:r>
           </w:p>
         </w:tc>
         <w:tc>
           <w:tcPr>
-            <w:tcW w:type="dxa" w:w="2880"/>
-          </w:tcPr>
-          <w:p>
-            <w:r>
-              <w:t>Prateleira com peças paradas</w:t>
-            </w:r>
-          </w:p>
-        </w:tc>
-        <w:tc>
-          <w:tcPr>
-            <w:tcW w:type="dxa" w:w="2880"/>
+            <w:tcW w:type="dxa" w:w="4320"/>
           </w:tcPr>
           <w:p>
             <w:r>
@@ -5455,27 +4545,17 @@
       <w:tr>
         <w:tc>
           <w:tcPr>
-            <w:tcW w:type="dxa" w:w="2880"/>
+            <w:tcW w:type="dxa" w:w="4320"/>
           </w:tcPr>
           <w:p>
             <w:r>
-              <w:t>4–16s</w:t>
+              <w:t>Você à câmera</w:t>
             </w:r>
           </w:p>
         </w:tc>
         <w:tc>
           <w:tcPr>
-            <w:tcW w:type="dxa" w:w="2880"/>
-          </w:tcPr>
-          <w:p>
-            <w:r>
-              <w:t>Você à câmera</w:t>
-            </w:r>
-          </w:p>
-        </w:tc>
-        <w:tc>
-          <w:tcPr>
-            <w:tcW w:type="dxa" w:w="2880"/>
+            <w:tcW w:type="dxa" w:w="4320"/>
           </w:tcPr>
           <w:p>
             <w:r>
@@ -5487,27 +4567,17 @@
       <w:tr>
         <w:tc>
           <w:tcPr>
-            <w:tcW w:type="dxa" w:w="2880"/>
+            <w:tcW w:type="dxa" w:w="4320"/>
           </w:tcPr>
           <w:p>
             <w:r>
-              <w:t>16–30s</w:t>
+              <w:t>Mostre a necessaire e a Mimo</w:t>
             </w:r>
           </w:p>
         </w:tc>
         <w:tc>
           <w:tcPr>
-            <w:tcW w:type="dxa" w:w="2880"/>
-          </w:tcPr>
-          <w:p>
-            <w:r>
-              <w:t>Mostre a necessaire e a Mimo</w:t>
-            </w:r>
-          </w:p>
-        </w:tc>
-        <w:tc>
-          <w:tcPr>
-            <w:tcW w:type="dxa" w:w="2880"/>
+            <w:tcW w:type="dxa" w:w="4320"/>
           </w:tcPr>
           <w:p>
             <w:r>
@@ -5528,27 +4598,17 @@
       <w:tr>
         <w:tc>
           <w:tcPr>
-            <w:tcW w:type="dxa" w:w="2880"/>
+            <w:tcW w:type="dxa" w:w="4320"/>
           </w:tcPr>
           <w:p>
             <w:r>
-              <w:t>30–42s</w:t>
+              <w:t>Você à câmera</w:t>
             </w:r>
           </w:p>
         </w:tc>
         <w:tc>
           <w:tcPr>
-            <w:tcW w:type="dxa" w:w="2880"/>
-          </w:tcPr>
-          <w:p>
-            <w:r>
-              <w:t>Você à câmera</w:t>
-            </w:r>
-          </w:p>
-        </w:tc>
-        <w:tc>
-          <w:tcPr>
-            <w:tcW w:type="dxa" w:w="2880"/>
+            <w:tcW w:type="dxa" w:w="4320"/>
           </w:tcPr>
           <w:p>
             <w:r>
@@ -5564,7 +4624,7 @@
         <w:pStyle w:val="Heading2"/>
       </w:pPr>
       <w:r>
-        <w:t>Roteiro 16: Pouco capital (Reels, 40 a 50s)</w:t>
+        <w:t>Roteiro 16: Pouco capital</w:t>
       </w:r>
     </w:p>
     <w:p>
@@ -5615,40 +4675,26 @@
         <w:tblLook w:firstColumn="1" w:firstRow="1" w:lastColumn="0" w:lastRow="0" w:noHBand="0" w:noVBand="1" w:val="04A0"/>
       </w:tblPr>
       <w:tblGrid>
-        <w:gridCol w:w="2880"/>
-        <w:gridCol w:w="2880"/>
-        <w:gridCol w:w="2880"/>
+        <w:gridCol w:w="4320"/>
+        <w:gridCol w:w="4320"/>
       </w:tblGrid>
       <w:tr>
         <w:tc>
           <w:tcPr>
-            <w:tcW w:type="dxa" w:w="2880"/>
+            <w:tcW w:type="dxa" w:w="4320"/>
           </w:tcPr>
           <w:p>
             <w:r>
               <w:rPr>
                 <w:b/>
               </w:rPr>
-              <w:t>Tempo</w:t>
+              <w:t>Visual</w:t>
             </w:r>
           </w:p>
         </w:tc>
         <w:tc>
           <w:tcPr>
-            <w:tcW w:type="dxa" w:w="2880"/>
-          </w:tcPr>
-          <w:p>
-            <w:r>
-              <w:rPr>
-                <w:b/>
-              </w:rPr>
-              <w:t>Visual</w:t>
-            </w:r>
-          </w:p>
-        </w:tc>
-        <w:tc>
-          <w:tcPr>
-            <w:tcW w:type="dxa" w:w="2880"/>
+            <w:tcW w:type="dxa" w:w="4320"/>
           </w:tcPr>
           <w:p>
             <w:r>
@@ -5663,27 +4709,17 @@
       <w:tr>
         <w:tc>
           <w:tcPr>
-            <w:tcW w:type="dxa" w:w="2880"/>
+            <w:tcW w:type="dxa" w:w="4320"/>
           </w:tcPr>
           <w:p>
             <w:r>
-              <w:t>0–4s</w:t>
+              <w:t>Você à câmera</w:t>
             </w:r>
           </w:p>
         </w:tc>
         <w:tc>
           <w:tcPr>
-            <w:tcW w:type="dxa" w:w="2880"/>
-          </w:tcPr>
-          <w:p>
-            <w:r>
-              <w:t>Você à câmera</w:t>
-            </w:r>
-          </w:p>
-        </w:tc>
-        <w:tc>
-          <w:tcPr>
-            <w:tcW w:type="dxa" w:w="2880"/>
+            <w:tcW w:type="dxa" w:w="4320"/>
           </w:tcPr>
           <w:p>
             <w:r>
@@ -5695,27 +4731,17 @@
       <w:tr>
         <w:tc>
           <w:tcPr>
-            <w:tcW w:type="dxa" w:w="2880"/>
+            <w:tcW w:type="dxa" w:w="4320"/>
           </w:tcPr>
           <w:p>
             <w:r>
-              <w:t>4–16s</w:t>
+              <w:t>Você à câmera</w:t>
             </w:r>
           </w:p>
         </w:tc>
         <w:tc>
           <w:tcPr>
-            <w:tcW w:type="dxa" w:w="2880"/>
-          </w:tcPr>
-          <w:p>
-            <w:r>
-              <w:t>Você à câmera</w:t>
-            </w:r>
-          </w:p>
-        </w:tc>
-        <w:tc>
-          <w:tcPr>
-            <w:tcW w:type="dxa" w:w="2880"/>
+            <w:tcW w:type="dxa" w:w="4320"/>
           </w:tcPr>
           <w:p>
             <w:r>
@@ -5727,27 +4753,17 @@
       <w:tr>
         <w:tc>
           <w:tcPr>
-            <w:tcW w:type="dxa" w:w="2880"/>
+            <w:tcW w:type="dxa" w:w="4320"/>
           </w:tcPr>
           <w:p>
             <w:r>
-              <w:t>16–30s</w:t>
+              <w:t>Conta na tela</w:t>
             </w:r>
           </w:p>
         </w:tc>
         <w:tc>
           <w:tcPr>
-            <w:tcW w:type="dxa" w:w="2880"/>
-          </w:tcPr>
-          <w:p>
-            <w:r>
-              <w:t>Conta na tela</w:t>
-            </w:r>
-          </w:p>
-        </w:tc>
-        <w:tc>
-          <w:tcPr>
-            <w:tcW w:type="dxa" w:w="2880"/>
+            <w:tcW w:type="dxa" w:w="4320"/>
           </w:tcPr>
           <w:p>
             <w:r>
@@ -5795,27 +4811,17 @@
       <w:tr>
         <w:tc>
           <w:tcPr>
-            <w:tcW w:type="dxa" w:w="2880"/>
+            <w:tcW w:type="dxa" w:w="4320"/>
           </w:tcPr>
           <w:p>
             <w:r>
-              <w:t>30–42s</w:t>
+              <w:t>Você à câmera</w:t>
             </w:r>
           </w:p>
         </w:tc>
         <w:tc>
           <w:tcPr>
-            <w:tcW w:type="dxa" w:w="2880"/>
-          </w:tcPr>
-          <w:p>
-            <w:r>
-              <w:t>Você à câmera</w:t>
-            </w:r>
-          </w:p>
-        </w:tc>
-        <w:tc>
-          <w:tcPr>
-            <w:tcW w:type="dxa" w:w="2880"/>
+            <w:tcW w:type="dxa" w:w="4320"/>
           </w:tcPr>
           <w:p>
             <w:r>
@@ -5831,7 +4837,7 @@
         <w:pStyle w:val="Heading2"/>
       </w:pPr>
       <w:r>
-        <w:t>Roteiro 17: Prova social de ateliê (Reels, 40 a 50s)</w:t>
+        <w:t>Roteiro 17: Prova social de ateliê</w:t>
       </w:r>
     </w:p>
     <w:p>
@@ -5882,40 +4888,26 @@
         <w:tblLook w:firstColumn="1" w:firstRow="1" w:lastColumn="0" w:lastRow="0" w:noHBand="0" w:noVBand="1" w:val="04A0"/>
       </w:tblPr>
       <w:tblGrid>
-        <w:gridCol w:w="2880"/>
-        <w:gridCol w:w="2880"/>
-        <w:gridCol w:w="2880"/>
+        <w:gridCol w:w="4320"/>
+        <w:gridCol w:w="4320"/>
       </w:tblGrid>
       <w:tr>
         <w:tc>
           <w:tcPr>
-            <w:tcW w:type="dxa" w:w="2880"/>
+            <w:tcW w:type="dxa" w:w="4320"/>
           </w:tcPr>
           <w:p>
             <w:r>
               <w:rPr>
                 <w:b/>
               </w:rPr>
-              <w:t>Tempo</w:t>
+              <w:t>Visual</w:t>
             </w:r>
           </w:p>
         </w:tc>
         <w:tc>
           <w:tcPr>
-            <w:tcW w:type="dxa" w:w="2880"/>
-          </w:tcPr>
-          <w:p>
-            <w:r>
-              <w:rPr>
-                <w:b/>
-              </w:rPr>
-              <w:t>Visual</w:t>
-            </w:r>
-          </w:p>
-        </w:tc>
-        <w:tc>
-          <w:tcPr>
-            <w:tcW w:type="dxa" w:w="2880"/>
+            <w:tcW w:type="dxa" w:w="4320"/>
           </w:tcPr>
           <w:p>
             <w:r>
@@ -5930,27 +4922,17 @@
       <w:tr>
         <w:tc>
           <w:tcPr>
-            <w:tcW w:type="dxa" w:w="2880"/>
+            <w:tcW w:type="dxa" w:w="4320"/>
           </w:tcPr>
           <w:p>
             <w:r>
-              <w:t>0–4s</w:t>
+              <w:t>Foto do ateliê da aluna</w:t>
             </w:r>
           </w:p>
         </w:tc>
         <w:tc>
           <w:tcPr>
-            <w:tcW w:type="dxa" w:w="2880"/>
-          </w:tcPr>
-          <w:p>
-            <w:r>
-              <w:t>Foto do ateliê da aluna</w:t>
-            </w:r>
-          </w:p>
-        </w:tc>
-        <w:tc>
-          <w:tcPr>
-            <w:tcW w:type="dxa" w:w="2880"/>
+            <w:tcW w:type="dxa" w:w="4320"/>
           </w:tcPr>
           <w:p>
             <w:r>
@@ -5962,27 +4944,17 @@
       <w:tr>
         <w:tc>
           <w:tcPr>
-            <w:tcW w:type="dxa" w:w="2880"/>
+            <w:tcW w:type="dxa" w:w="4320"/>
           </w:tcPr>
           <w:p>
             <w:r>
-              <w:t>4–18s</w:t>
+              <w:t>Vídeo ou áudio da aluna (real, autorizado)</w:t>
             </w:r>
           </w:p>
         </w:tc>
         <w:tc>
           <w:tcPr>
-            <w:tcW w:type="dxa" w:w="2880"/>
-          </w:tcPr>
-          <w:p>
-            <w:r>
-              <w:t>Vídeo ou áudio da aluna (real, autorizado)</w:t>
-            </w:r>
-          </w:p>
-        </w:tc>
-        <w:tc>
-          <w:tcPr>
-            <w:tcW w:type="dxa" w:w="2880"/>
+            <w:tcW w:type="dxa" w:w="4320"/>
           </w:tcPr>
           <w:p>
             <w:r>
@@ -6030,27 +5002,17 @@
       <w:tr>
         <w:tc>
           <w:tcPr>
-            <w:tcW w:type="dxa" w:w="2880"/>
+            <w:tcW w:type="dxa" w:w="4320"/>
           </w:tcPr>
           <w:p>
             <w:r>
-              <w:t>18–32s</w:t>
+              <w:t>Você à câmera</w:t>
             </w:r>
           </w:p>
         </w:tc>
         <w:tc>
           <w:tcPr>
-            <w:tcW w:type="dxa" w:w="2880"/>
-          </w:tcPr>
-          <w:p>
-            <w:r>
-              <w:t>Você à câmera</w:t>
-            </w:r>
-          </w:p>
-        </w:tc>
-        <w:tc>
-          <w:tcPr>
-            <w:tcW w:type="dxa" w:w="2880"/>
+            <w:tcW w:type="dxa" w:w="4320"/>
           </w:tcPr>
           <w:p>
             <w:r>
@@ -6062,27 +5024,17 @@
       <w:tr>
         <w:tc>
           <w:tcPr>
-            <w:tcW w:type="dxa" w:w="2880"/>
+            <w:tcW w:type="dxa" w:w="4320"/>
           </w:tcPr>
           <w:p>
             <w:r>
-              <w:t>32–42s</w:t>
+              <w:t>Você à câmera</w:t>
             </w:r>
           </w:p>
         </w:tc>
         <w:tc>
           <w:tcPr>
-            <w:tcW w:type="dxa" w:w="2880"/>
-          </w:tcPr>
-          <w:p>
-            <w:r>
-              <w:t>Você à câmera</w:t>
-            </w:r>
-          </w:p>
-        </w:tc>
-        <w:tc>
-          <w:tcPr>
-            <w:tcW w:type="dxa" w:w="2880"/>
+            <w:tcW w:type="dxa" w:w="4320"/>
           </w:tcPr>
           <w:p>
             <w:r>
@@ -6117,7 +5069,7 @@
         <w:pStyle w:val="Heading2"/>
       </w:pPr>
       <w:r>
-        <w:t>Roteiro 18: Quebra de objeções (Reels ou story, 45 a 60s)</w:t>
+        <w:t>Roteiro 18: Quebra de objeções</w:t>
       </w:r>
     </w:p>
     <w:p>
@@ -6159,40 +5111,26 @@
         <w:tblLook w:firstColumn="1" w:firstRow="1" w:lastColumn="0" w:lastRow="0" w:noHBand="0" w:noVBand="1" w:val="04A0"/>
       </w:tblPr>
       <w:tblGrid>
-        <w:gridCol w:w="2880"/>
-        <w:gridCol w:w="2880"/>
-        <w:gridCol w:w="2880"/>
+        <w:gridCol w:w="4320"/>
+        <w:gridCol w:w="4320"/>
       </w:tblGrid>
       <w:tr>
         <w:tc>
           <w:tcPr>
-            <w:tcW w:type="dxa" w:w="2880"/>
+            <w:tcW w:type="dxa" w:w="4320"/>
           </w:tcPr>
           <w:p>
             <w:r>
               <w:rPr>
                 <w:b/>
               </w:rPr>
-              <w:t>Tempo</w:t>
+              <w:t>Visual</w:t>
             </w:r>
           </w:p>
         </w:tc>
         <w:tc>
           <w:tcPr>
-            <w:tcW w:type="dxa" w:w="2880"/>
-          </w:tcPr>
-          <w:p>
-            <w:r>
-              <w:rPr>
-                <w:b/>
-              </w:rPr>
-              <w:t>Visual</w:t>
-            </w:r>
-          </w:p>
-        </w:tc>
-        <w:tc>
-          <w:tcPr>
-            <w:tcW w:type="dxa" w:w="2880"/>
+            <w:tcW w:type="dxa" w:w="4320"/>
           </w:tcPr>
           <w:p>
             <w:r>
@@ -6207,27 +5145,17 @@
       <w:tr>
         <w:tc>
           <w:tcPr>
-            <w:tcW w:type="dxa" w:w="2880"/>
+            <w:tcW w:type="dxa" w:w="4320"/>
           </w:tcPr>
           <w:p>
             <w:r>
-              <w:t>0–4s</w:t>
+              <w:t>Você à câmera</w:t>
             </w:r>
           </w:p>
         </w:tc>
         <w:tc>
           <w:tcPr>
-            <w:tcW w:type="dxa" w:w="2880"/>
-          </w:tcPr>
-          <w:p>
-            <w:r>
-              <w:t>Você à câmera</w:t>
-            </w:r>
-          </w:p>
-        </w:tc>
-        <w:tc>
-          <w:tcPr>
-            <w:tcW w:type="dxa" w:w="2880"/>
+            <w:tcW w:type="dxa" w:w="4320"/>
           </w:tcPr>
           <w:p>
             <w:r>
@@ -6239,27 +5167,17 @@
       <w:tr>
         <w:tc>
           <w:tcPr>
-            <w:tcW w:type="dxa" w:w="2880"/>
+            <w:tcW w:type="dxa" w:w="4320"/>
           </w:tcPr>
           <w:p>
             <w:r>
-              <w:t>4–16s</w:t>
+              <w:t>Texto na tela: "Não tenho experiência"</w:t>
             </w:r>
           </w:p>
         </w:tc>
         <w:tc>
           <w:tcPr>
-            <w:tcW w:type="dxa" w:w="2880"/>
-          </w:tcPr>
-          <w:p>
-            <w:r>
-              <w:t>Texto na tela: "Não tenho experiência"</w:t>
-            </w:r>
-          </w:p>
-        </w:tc>
-        <w:tc>
-          <w:tcPr>
-            <w:tcW w:type="dxa" w:w="2880"/>
+            <w:tcW w:type="dxa" w:w="4320"/>
           </w:tcPr>
           <w:p>
             <w:r>
@@ -6280,27 +5198,17 @@
       <w:tr>
         <w:tc>
           <w:tcPr>
-            <w:tcW w:type="dxa" w:w="2880"/>
+            <w:tcW w:type="dxa" w:w="4320"/>
           </w:tcPr>
           <w:p>
             <w:r>
-              <w:t>16–30s</w:t>
+              <w:t>Texto na tela: "Não sei se vou vender"</w:t>
             </w:r>
           </w:p>
         </w:tc>
         <w:tc>
           <w:tcPr>
-            <w:tcW w:type="dxa" w:w="2880"/>
-          </w:tcPr>
-          <w:p>
-            <w:r>
-              <w:t>Texto na tela: "Não sei se vou vender"</w:t>
-            </w:r>
-          </w:p>
-        </w:tc>
-        <w:tc>
-          <w:tcPr>
-            <w:tcW w:type="dxa" w:w="2880"/>
+            <w:tcW w:type="dxa" w:w="4320"/>
           </w:tcPr>
           <w:p>
             <w:r>
@@ -6327,27 +5235,17 @@
       <w:tr>
         <w:tc>
           <w:tcPr>
-            <w:tcW w:type="dxa" w:w="2880"/>
+            <w:tcW w:type="dxa" w:w="4320"/>
           </w:tcPr>
           <w:p>
             <w:r>
-              <w:t>30–44s</w:t>
+              <w:t>Texto na tela: "E se eu não gostar?"</w:t>
             </w:r>
           </w:p>
         </w:tc>
         <w:tc>
           <w:tcPr>
-            <w:tcW w:type="dxa" w:w="2880"/>
-          </w:tcPr>
-          <w:p>
-            <w:r>
-              <w:t>Texto na tela: "E se eu não gostar?"</w:t>
-            </w:r>
-          </w:p>
-        </w:tc>
-        <w:tc>
-          <w:tcPr>
-            <w:tcW w:type="dxa" w:w="2880"/>
+            <w:tcW w:type="dxa" w:w="4320"/>
           </w:tcPr>
           <w:p>
             <w:r>
@@ -6377,27 +5275,17 @@
       <w:tr>
         <w:tc>
           <w:tcPr>
-            <w:tcW w:type="dxa" w:w="2880"/>
+            <w:tcW w:type="dxa" w:w="4320"/>
           </w:tcPr>
           <w:p>
             <w:r>
-              <w:t>44–56s</w:t>
+              <w:t>Você à câmera</w:t>
             </w:r>
           </w:p>
         </w:tc>
         <w:tc>
           <w:tcPr>
-            <w:tcW w:type="dxa" w:w="2880"/>
-          </w:tcPr>
-          <w:p>
-            <w:r>
-              <w:t>Você à câmera</w:t>
-            </w:r>
-          </w:p>
-        </w:tc>
-        <w:tc>
-          <w:tcPr>
-            <w:tcW w:type="dxa" w:w="2880"/>
+            <w:tcW w:type="dxa" w:w="4320"/>
           </w:tcPr>
           <w:p>
             <w:r>
@@ -6413,7 +5301,7 @@
         <w:pStyle w:val="Heading2"/>
       </w:pPr>
       <w:r>
-        <w:t>Roteiro 19: Última chamada de fim de ano (Reels ou story, 25 a 35s)</w:t>
+        <w:t>Roteiro 19: Última chamada de fim de ano</w:t>
       </w:r>
     </w:p>
     <w:p>
@@ -6473,40 +5361,26 @@
         <w:tblLook w:firstColumn="1" w:firstRow="1" w:lastColumn="0" w:lastRow="0" w:noHBand="0" w:noVBand="1" w:val="04A0"/>
       </w:tblPr>
       <w:tblGrid>
-        <w:gridCol w:w="2880"/>
-        <w:gridCol w:w="2880"/>
-        <w:gridCol w:w="2880"/>
+        <w:gridCol w:w="4320"/>
+        <w:gridCol w:w="4320"/>
       </w:tblGrid>
       <w:tr>
         <w:tc>
           <w:tcPr>
-            <w:tcW w:type="dxa" w:w="2880"/>
+            <w:tcW w:type="dxa" w:w="4320"/>
           </w:tcPr>
           <w:p>
             <w:r>
               <w:rPr>
                 <w:b/>
               </w:rPr>
-              <w:t>Tempo</w:t>
+              <w:t>Visual</w:t>
             </w:r>
           </w:p>
         </w:tc>
         <w:tc>
           <w:tcPr>
-            <w:tcW w:type="dxa" w:w="2880"/>
-          </w:tcPr>
-          <w:p>
-            <w:r>
-              <w:rPr>
-                <w:b/>
-              </w:rPr>
-              <w:t>Visual</w:t>
-            </w:r>
-          </w:p>
-        </w:tc>
-        <w:tc>
-          <w:tcPr>
-            <w:tcW w:type="dxa" w:w="2880"/>
+            <w:tcW w:type="dxa" w:w="4320"/>
           </w:tcPr>
           <w:p>
             <w:r>
@@ -6521,27 +5395,17 @@
       <w:tr>
         <w:tc>
           <w:tcPr>
-            <w:tcW w:type="dxa" w:w="2880"/>
+            <w:tcW w:type="dxa" w:w="4320"/>
           </w:tcPr>
           <w:p>
             <w:r>
-              <w:t>0–4s</w:t>
+              <w:t>Relógio ou calendário</w:t>
             </w:r>
           </w:p>
         </w:tc>
         <w:tc>
           <w:tcPr>
-            <w:tcW w:type="dxa" w:w="2880"/>
-          </w:tcPr>
-          <w:p>
-            <w:r>
-              <w:t>Relógio ou calendário</w:t>
-            </w:r>
-          </w:p>
-        </w:tc>
-        <w:tc>
-          <w:tcPr>
-            <w:tcW w:type="dxa" w:w="2880"/>
+            <w:tcW w:type="dxa" w:w="4320"/>
           </w:tcPr>
           <w:p>
             <w:r>
@@ -6553,27 +5417,17 @@
       <w:tr>
         <w:tc>
           <w:tcPr>
-            <w:tcW w:type="dxa" w:w="2880"/>
+            <w:tcW w:type="dxa" w:w="4320"/>
           </w:tcPr>
           <w:p>
             <w:r>
-              <w:t>4–18s</w:t>
+              <w:t>Você à câmera</w:t>
             </w:r>
           </w:p>
         </w:tc>
         <w:tc>
           <w:tcPr>
-            <w:tcW w:type="dxa" w:w="2880"/>
-          </w:tcPr>
-          <w:p>
-            <w:r>
-              <w:t>Você à câmera</w:t>
-            </w:r>
-          </w:p>
-        </w:tc>
-        <w:tc>
-          <w:tcPr>
-            <w:tcW w:type="dxa" w:w="2880"/>
+            <w:tcW w:type="dxa" w:w="4320"/>
           </w:tcPr>
           <w:p>
             <w:r>
@@ -6603,27 +5457,17 @@
       <w:tr>
         <w:tc>
           <w:tcPr>
-            <w:tcW w:type="dxa" w:w="2880"/>
+            <w:tcW w:type="dxa" w:w="4320"/>
           </w:tcPr>
           <w:p>
             <w:r>
-              <w:t>18–30s</w:t>
+              <w:t>Você à câmera</w:t>
             </w:r>
           </w:p>
         </w:tc>
         <w:tc>
           <w:tcPr>
-            <w:tcW w:type="dxa" w:w="2880"/>
-          </w:tcPr>
-          <w:p>
-            <w:r>
-              <w:t>Você à câmera</w:t>
-            </w:r>
-          </w:p>
-        </w:tc>
-        <w:tc>
-          <w:tcPr>
-            <w:tcW w:type="dxa" w:w="2880"/>
+            <w:tcW w:type="dxa" w:w="4320"/>
           </w:tcPr>
           <w:p>
             <w:r>
@@ -6639,7 +5483,7 @@
         <w:pStyle w:val="Heading2"/>
       </w:pPr>
       <w:r>
-        <w:t>Roteiro 20: Demonstração do produto, "como funciona" (Reels, 45 a 60s)</w:t>
+        <w:t>Roteiro 20: Demonstração do produto, "como funciona"</w:t>
       </w:r>
     </w:p>
     <w:p>
@@ -6701,40 +5545,26 @@
         <w:tblLook w:firstColumn="1" w:firstRow="1" w:lastColumn="0" w:lastRow="0" w:noHBand="0" w:noVBand="1" w:val="04A0"/>
       </w:tblPr>
       <w:tblGrid>
-        <w:gridCol w:w="2880"/>
-        <w:gridCol w:w="2880"/>
-        <w:gridCol w:w="2880"/>
+        <w:gridCol w:w="4320"/>
+        <w:gridCol w:w="4320"/>
       </w:tblGrid>
       <w:tr>
         <w:tc>
           <w:tcPr>
-            <w:tcW w:type="dxa" w:w="2880"/>
+            <w:tcW w:type="dxa" w:w="4320"/>
           </w:tcPr>
           <w:p>
             <w:r>
               <w:rPr>
                 <w:b/>
               </w:rPr>
-              <w:t>Tempo</w:t>
+              <w:t>Visual</w:t>
             </w:r>
           </w:p>
         </w:tc>
         <w:tc>
           <w:tcPr>
-            <w:tcW w:type="dxa" w:w="2880"/>
-          </w:tcPr>
-          <w:p>
-            <w:r>
-              <w:rPr>
-                <w:b/>
-              </w:rPr>
-              <w:t>Visual</w:t>
-            </w:r>
-          </w:p>
-        </w:tc>
-        <w:tc>
-          <w:tcPr>
-            <w:tcW w:type="dxa" w:w="2880"/>
+            <w:tcW w:type="dxa" w:w="4320"/>
           </w:tcPr>
           <w:p>
             <w:r>
@@ -6749,27 +5579,17 @@
       <w:tr>
         <w:tc>
           <w:tcPr>
-            <w:tcW w:type="dxa" w:w="2880"/>
+            <w:tcW w:type="dxa" w:w="4320"/>
           </w:tcPr>
           <w:p>
             <w:r>
-              <w:t>0–4s</w:t>
+              <w:t>Necessaire fechada, câmera girando</w:t>
             </w:r>
           </w:p>
         </w:tc>
         <w:tc>
           <w:tcPr>
-            <w:tcW w:type="dxa" w:w="2880"/>
-          </w:tcPr>
-          <w:p>
-            <w:r>
-              <w:t>Necessaire fechada, câmera girando</w:t>
-            </w:r>
-          </w:p>
-        </w:tc>
-        <w:tc>
-          <w:tcPr>
-            <w:tcW w:type="dxa" w:w="2880"/>
+            <w:tcW w:type="dxa" w:w="4320"/>
           </w:tcPr>
           <w:p>
             <w:r>
@@ -6781,27 +5601,17 @@
       <w:tr>
         <w:tc>
           <w:tcPr>
-            <w:tcW w:type="dxa" w:w="2880"/>
+            <w:tcW w:type="dxa" w:w="4320"/>
           </w:tcPr>
           <w:p>
             <w:r>
-              <w:t>4–16s</w:t>
+              <w:t>Abra o zíper, mostre o interior</w:t>
             </w:r>
           </w:p>
         </w:tc>
         <w:tc>
           <w:tcPr>
-            <w:tcW w:type="dxa" w:w="2880"/>
-          </w:tcPr>
-          <w:p>
-            <w:r>
-              <w:t>Abra o zíper, mostre o interior</w:t>
-            </w:r>
-          </w:p>
-        </w:tc>
-        <w:tc>
-          <w:tcPr>
-            <w:tcW w:type="dxa" w:w="2880"/>
+            <w:tcW w:type="dxa" w:w="4320"/>
           </w:tcPr>
           <w:p>
             <w:r>
@@ -6813,27 +5623,17 @@
       <w:tr>
         <w:tc>
           <w:tcPr>
-            <w:tcW w:type="dxa" w:w="2880"/>
+            <w:tcW w:type="dxa" w:w="4320"/>
           </w:tcPr>
           <w:p>
             <w:r>
-              <w:t>16–28s</w:t>
+              <w:t>Close na costura</w:t>
             </w:r>
           </w:p>
         </w:tc>
         <w:tc>
           <w:tcPr>
-            <w:tcW w:type="dxa" w:w="2880"/>
-          </w:tcPr>
-          <w:p>
-            <w:r>
-              <w:t>Close na costura</w:t>
-            </w:r>
-          </w:p>
-        </w:tc>
-        <w:tc>
-          <w:tcPr>
-            <w:tcW w:type="dxa" w:w="2880"/>
+            <w:tcW w:type="dxa" w:w="4320"/>
           </w:tcPr>
           <w:p>
             <w:r>
@@ -6845,27 +5645,17 @@
       <w:tr>
         <w:tc>
           <w:tcPr>
-            <w:tcW w:type="dxa" w:w="2880"/>
+            <w:tcW w:type="dxa" w:w="4320"/>
           </w:tcPr>
           <w:p>
             <w:r>
-              <w:t>28–40s</w:t>
+              <w:t>Mostre em uso, com maquiagem dentro</w:t>
             </w:r>
           </w:p>
         </w:tc>
         <w:tc>
           <w:tcPr>
-            <w:tcW w:type="dxa" w:w="2880"/>
-          </w:tcPr>
-          <w:p>
-            <w:r>
-              <w:t>Mostre em uso, com maquiagem dentro</w:t>
-            </w:r>
-          </w:p>
-        </w:tc>
-        <w:tc>
-          <w:tcPr>
-            <w:tcW w:type="dxa" w:w="2880"/>
+            <w:tcW w:type="dxa" w:w="4320"/>
           </w:tcPr>
           <w:p>
             <w:r>
@@ -6877,27 +5667,17 @@
       <w:tr>
         <w:tc>
           <w:tcPr>
-            <w:tcW w:type="dxa" w:w="2880"/>
+            <w:tcW w:type="dxa" w:w="4320"/>
           </w:tcPr>
           <w:p>
             <w:r>
-              <w:t>40–52s</w:t>
+              <w:t>Você à câmera</w:t>
             </w:r>
           </w:p>
         </w:tc>
         <w:tc>
           <w:tcPr>
-            <w:tcW w:type="dxa" w:w="2880"/>
-          </w:tcPr>
-          <w:p>
-            <w:r>
-              <w:t>Você à câmera</w:t>
-            </w:r>
-          </w:p>
-        </w:tc>
-        <w:tc>
-          <w:tcPr>
-            <w:tcW w:type="dxa" w:w="2880"/>
+            <w:tcW w:type="dxa" w:w="4320"/>
           </w:tcPr>
           <w:p>
             <w:r>

</xml_diff>

<commit_message>
Reescreve CTAs com foco em compra: ação, benefício, garantia e urgência
Co-Authored-By: Claude Sonnet 5.5 <noreply@anthropic.com>
Claude-Session: https://claude.ai/code/session_01A1uq3DMjJX968bUrHfUPw3
</commit_message>
<xml_diff>
--- a/roteiros-venda/Roteiros-Necessaire-Make-e-Termica-Mimo.docx
+++ b/roteiros-venda/Roteiros-Necessaire-Make-e-Termica-Mimo.docx
@@ -153,6 +153,299 @@
       </w:pPr>
       <w:r>
         <w:t>Formato pensado para Reels, TikTok e anúncio em vídeo vertical (9:16).</w:t>
+      </w:r>
+    </w:p>
+    <w:p>
+      <w:pPr>
+        <w:pStyle w:val="Heading2"/>
+      </w:pPr>
+      <w:r>
+        <w:t>Como montar uma CTA que leva à compra</w:t>
+      </w:r>
+    </w:p>
+    <w:p>
+      <w:r>
+        <w:t>Toda CTA final segue esta fórmula, nesta ordem:</w:t>
+      </w:r>
+    </w:p>
+    <w:p>
+      <w:pPr>
+        <w:ind w:left="340"/>
+      </w:pPr>
+      <w:r>
+        <w:t xml:space="preserve">1. </w:t>
+      </w:r>
+      <w:r>
+        <w:rPr>
+          <w:b/>
+        </w:rPr>
+        <w:t>Ação de compra clara:</w:t>
+      </w:r>
+      <w:r>
+        <w:t xml:space="preserve"> "Garanta o projeto", "Clique no botão abaixo". Nunca "dá uma olhada" ou "vê se gosta".</w:t>
+      </w:r>
+    </w:p>
+    <w:p>
+      <w:pPr>
+        <w:ind w:left="340"/>
+      </w:pPr>
+      <w:r>
+        <w:t xml:space="preserve">2. </w:t>
+      </w:r>
+      <w:r>
+        <w:rPr>
+          <w:b/>
+        </w:rPr>
+        <w:t>Benefício concreto:</w:t>
+      </w:r>
+      <w:r>
+        <w:t xml:space="preserve"> o que a pessoa ganha (primeira venda esta semana, produto pronto antes do Natal).</w:t>
+      </w:r>
+    </w:p>
+    <w:p>
+      <w:pPr>
+        <w:ind w:left="340"/>
+      </w:pPr>
+      <w:r>
+        <w:t xml:space="preserve">3. </w:t>
+      </w:r>
+      <w:r>
+        <w:rPr>
+          <w:b/>
+        </w:rPr>
+        <w:t>Redução de risco:</w:t>
+      </w:r>
+      <w:r>
+        <w:t xml:space="preserve"> garantia de </w:t>
+      </w:r>
+      <w:r>
+        <w:rPr>
+          <w:b/>
+        </w:rPr>
+        <w:t>[__] dias</w:t>
+      </w:r>
+      <w:r>
+        <w:t>, preço ou conta que fecha.</w:t>
+      </w:r>
+    </w:p>
+    <w:p>
+      <w:pPr>
+        <w:ind w:left="340"/>
+      </w:pPr>
+      <w:r>
+        <w:t xml:space="preserve">4. </w:t>
+      </w:r>
+      <w:r>
+        <w:rPr>
+          <w:b/>
+        </w:rPr>
+        <w:t>Motivo para agir agora:</w:t>
+      </w:r>
+      <w:r>
+        <w:t xml:space="preserve"> prazo de produção do Natal, </w:t>
+      </w:r>
+      <w:r>
+        <w:rPr>
+          <w:b/>
+        </w:rPr>
+        <w:t>[data]</w:t>
+      </w:r>
+      <w:r>
+        <w:t xml:space="preserve"> de corte, bônus ou condição que termina.</w:t>
+      </w:r>
+    </w:p>
+    <w:p>
+      <w:r>
+        <w:rPr>
+          <w:b/>
+        </w:rPr>
+        <w:t>Modelo:</w:t>
+      </w:r>
+      <w:r>
+        <w:t xml:space="preserve"> "Garanta o projeto agora no botão abaixo. Você recebe [benefício], tem [__] dias de garantia e ainda dá tempo de produzir antes do Natal."</w:t>
+      </w:r>
+    </w:p>
+    <w:p>
+      <w:pPr>
+        <w:pStyle w:val="Heading3"/>
+      </w:pPr>
+      <w:r>
+        <w:t>Banco de CTAs para trocar no final de qualquer vídeo</w:t>
+      </w:r>
+    </w:p>
+    <w:p>
+      <w:pPr>
+        <w:pStyle w:val="ListBullet"/>
+      </w:pPr>
+      <w:r>
+        <w:t xml:space="preserve">"Clique no botão abaixo e garanta o projeto da </w:t>
+      </w:r>
+      <w:r>
+        <w:rPr>
+          <w:b/>
+        </w:rPr>
+        <w:t>Necessaire Make</w:t>
+      </w:r>
+      <w:r>
+        <w:t xml:space="preserve"> por </w:t>
+      </w:r>
+      <w:r>
+        <w:rPr>
+          <w:b/>
+        </w:rPr>
+        <w:t>R$ [__]</w:t>
+      </w:r>
+      <w:r>
+        <w:t xml:space="preserve">. São </w:t>
+      </w:r>
+      <w:r>
+        <w:rPr>
+          <w:b/>
+        </w:rPr>
+        <w:t>[__] dias de garantia</w:t>
+      </w:r>
+      <w:r>
+        <w:t xml:space="preserve"> e você já começa hoje."</w:t>
+      </w:r>
+    </w:p>
+    <w:p>
+      <w:pPr>
+        <w:pStyle w:val="ListBullet"/>
+      </w:pPr>
+      <w:r>
+        <w:t xml:space="preserve">"Garanta agora o projeto da </w:t>
+      </w:r>
+      <w:r>
+        <w:rPr>
+          <w:b/>
+        </w:rPr>
+        <w:t>Térmica Mimo</w:t>
+      </w:r>
+      <w:r>
+        <w:t xml:space="preserve"> e comece a vender por </w:t>
+      </w:r>
+      <w:r>
+        <w:rPr>
+          <w:b/>
+        </w:rPr>
+        <w:t>R$ 145</w:t>
+      </w:r>
+      <w:r>
+        <w:t xml:space="preserve"> ainda esta semana."</w:t>
+      </w:r>
+    </w:p>
+    <w:p>
+      <w:pPr>
+        <w:pStyle w:val="ListBullet"/>
+      </w:pPr>
+      <w:r>
+        <w:t xml:space="preserve">"O projeto pode se pagar com </w:t>
+      </w:r>
+      <w:r>
+        <w:rPr>
+          <w:b/>
+        </w:rPr>
+        <w:t>[__] vendas</w:t>
+      </w:r>
+      <w:r>
+        <w:t xml:space="preserve">. Clique em </w:t>
+      </w:r>
+      <w:r>
+        <w:rPr>
+          <w:b/>
+        </w:rPr>
+        <w:t>Quero o projeto</w:t>
+      </w:r>
+      <w:r>
+        <w:t xml:space="preserve"> e faça a conta na prática."</w:t>
+      </w:r>
+    </w:p>
+    <w:p>
+      <w:pPr>
+        <w:pStyle w:val="ListBullet"/>
+      </w:pPr>
+      <w:r>
+        <w:t xml:space="preserve">"Quem entrar até </w:t>
+      </w:r>
+      <w:r>
+        <w:rPr>
+          <w:b/>
+        </w:rPr>
+        <w:t>[data]</w:t>
+      </w:r>
+      <w:r>
+        <w:t xml:space="preserve"> ainda produz e vende antes do Natal. Garanta o seu agora."</w:t>
+      </w:r>
+    </w:p>
+    <w:p>
+      <w:pPr>
+        <w:pStyle w:val="ListBullet"/>
+      </w:pPr>
+      <w:r>
+        <w:t xml:space="preserve">"Garanta hoje, teste por </w:t>
+      </w:r>
+      <w:r>
+        <w:rPr>
+          <w:b/>
+        </w:rPr>
+        <w:t>[__] dias</w:t>
+      </w:r>
+      <w:r>
+        <w:t xml:space="preserve"> e, se não fizer sentido, o seu dinheiro volta. Sem risco."</w:t>
+      </w:r>
+    </w:p>
+    <w:p>
+      <w:pPr>
+        <w:pStyle w:val="ListBullet"/>
+      </w:pPr>
+      <w:r>
+        <w:t xml:space="preserve">"Leve os dois projetos, </w:t>
+      </w:r>
+      <w:r>
+        <w:rPr>
+          <w:b/>
+        </w:rPr>
+        <w:t>Necessaire Make</w:t>
+      </w:r>
+      <w:r>
+        <w:t xml:space="preserve"> e </w:t>
+      </w:r>
+      <w:r>
+        <w:rPr>
+          <w:b/>
+        </w:rPr>
+        <w:t>Térmica Mimo</w:t>
+      </w:r>
+      <w:r>
+        <w:t>, e monte o kit de presente antes do Natal."</w:t>
+      </w:r>
+    </w:p>
+    <w:p>
+      <w:pPr>
+        <w:pStyle w:val="ListBullet"/>
+      </w:pPr>
+      <w:r>
+        <w:t xml:space="preserve">"Só hoje: </w:t>
+      </w:r>
+      <w:r>
+        <w:rPr>
+          <w:b/>
+        </w:rPr>
+        <w:t>[bônus/condição]</w:t>
+      </w:r>
+      <w:r>
+        <w:t xml:space="preserve"> junto com o projeto. Clique no botão abaixo e aproveite."</w:t>
+      </w:r>
+    </w:p>
+    <w:p>
+      <w:r>
+        <w:rPr>
+          <w:b/>
+        </w:rPr>
+        <w:t>Botões de anúncio recomendados:</w:t>
+      </w:r>
+      <w:r>
+        <w:t xml:space="preserve"> Comprar agora · Quero o projeto · Garantir minha vaga.</w:t>
       </w:r>
     </w:p>
     <w:p>
@@ -866,7 +1159,43 @@
           </w:tcPr>
           <w:p>
             <w:r>
-              <w:t>"Se ela conseguiu começando do zero, imagina você que já costura. Tem o passo a passo completo da necessaire e de como apresentar pra cliente. O link tá aqui embaixo. Clica e vê o projeto."</w:t>
+              <w:t xml:space="preserve">"Se ela conseguiu começando do zero, você que já costura pode chegar lá mais rápido. O projeto da </w:t>
+            </w:r>
+            <w:r>
+              <w:rPr>
+                <w:b/>
+              </w:rPr>
+              <w:t>Necessaire Make</w:t>
+            </w:r>
+            <w:r>
+              <w:t xml:space="preserve"> traz o passo a passo completo para produzir e para apresentar a peça à cliente. O investimento é de </w:t>
+            </w:r>
+            <w:r>
+              <w:rPr>
+                <w:b/>
+              </w:rPr>
+              <w:t>R$ [__]</w:t>
+            </w:r>
+            <w:r>
+              <w:t xml:space="preserve">, pode se pagar com </w:t>
+            </w:r>
+            <w:r>
+              <w:rPr>
+                <w:b/>
+              </w:rPr>
+              <w:t>[__] vendas</w:t>
+            </w:r>
+            <w:r>
+              <w:t xml:space="preserve"> e você tem </w:t>
+            </w:r>
+            <w:r>
+              <w:rPr>
+                <w:b/>
+              </w:rPr>
+              <w:t>[__] dias de garantia</w:t>
+            </w:r>
+            <w:r>
+              <w:t>. Clique no botão abaixo, garanta o seu projeto agora e comece a sua primeira necessaire ainda hoje."</w:t>
             </w:r>
           </w:p>
         </w:tc>
@@ -881,7 +1210,25 @@
         <w:t>CTA:</w:t>
       </w:r>
       <w:r>
-        <w:t xml:space="preserve"> "Clica no link e vê o projeto completo."</w:t>
+        <w:t xml:space="preserve"> "Clique no botão abaixo, garanta o projeto da Necessaire Make por </w:t>
+      </w:r>
+      <w:r>
+        <w:rPr>
+          <w:b/>
+        </w:rPr>
+        <w:t>R$ [__]</w:t>
+      </w:r>
+      <w:r>
+        <w:t xml:space="preserve"> e comece a produzir hoje, com </w:t>
+      </w:r>
+      <w:r>
+        <w:rPr>
+          <w:b/>
+        </w:rPr>
+        <w:t>[__] dias de garantia</w:t>
+      </w:r>
+      <w:r>
+        <w:t>."</w:t>
       </w:r>
     </w:p>
     <w:p>
@@ -892,7 +1239,7 @@
         <w:t>Legenda:</w:t>
       </w:r>
       <w:r>
-        <w:t xml:space="preserve"> "A [Maria] vendeu [5] necessaires no primeiro mês. Resultados variam de pessoa para pessoa. Link na bio."</w:t>
+        <w:t xml:space="preserve"> "A [Maria] vendeu [5] necessaires no primeiro mês. Resultados variam de pessoa para pessoa. Garanta o seu projeto pelo link da bio."</w:t>
       </w:r>
     </w:p>
     <w:p>
@@ -1283,7 +1630,7 @@
           </w:tcPr>
           <w:p>
             <w:r>
-              <w:t xml:space="preserve">"Se você quer começar, o projeto tá no link. </w:t>
+              <w:t xml:space="preserve">"Se você quer começar, o projeto está no botão abaixo. </w:t>
             </w:r>
             <w:r>
               <w:rPr>
@@ -1292,7 +1639,16 @@
               <w:t>Resultados variam</w:t>
             </w:r>
             <w:r>
-              <w:t>, mas o passo a passo é o mesmo pra todas."</w:t>
+              <w:t xml:space="preserve">, mas o passo a passo é o mesmo para todas, e você tem </w:t>
+            </w:r>
+            <w:r>
+              <w:rPr>
+                <w:b/>
+              </w:rPr>
+              <w:t>[__] dias de garantia</w:t>
+            </w:r>
+            <w:r>
+              <w:t xml:space="preserve"> para testar sem risco. Garanta o seu agora e comece ainda esta semana."</w:t>
             </w:r>
           </w:p>
         </w:tc>
@@ -1307,7 +1663,7 @@
         <w:t>CTA:</w:t>
       </w:r>
       <w:r>
-        <w:t xml:space="preserve"> "Link na descrição."</w:t>
+        <w:t xml:space="preserve"> "Garanta o projeto agora pelo botão abaixo e comece a sua primeira venda ainda esta semana."</w:t>
       </w:r>
     </w:p>
     <w:p>
@@ -1511,7 +1867,16 @@
           </w:tcPr>
           <w:p>
             <w:r>
-              <w:t>"Se você também quer viver isso, o projeto tá no link. A primeira venda pode ser essa semana."</w:t>
+              <w:t xml:space="preserve">"Se você também quer viver isso, garanta o projeto agora. Com o passo a passo você produz a primeira necessaire e pode fazer a sua primeira venda ainda esta semana. Clique em </w:t>
+            </w:r>
+            <w:r>
+              <w:rPr>
+                <w:b/>
+              </w:rPr>
+              <w:t>Quero o projeto</w:t>
+            </w:r>
+            <w:r>
+              <w:t xml:space="preserve"> e comece hoje."</w:t>
             </w:r>
           </w:p>
         </w:tc>
@@ -1526,7 +1891,7 @@
         <w:t>CTA:</w:t>
       </w:r>
       <w:r>
-        <w:t xml:space="preserve"> "Sua primeira venda pode ser essa semana. Link abaixo."</w:t>
+        <w:t xml:space="preserve"> "A sua primeira venda pode ser esta semana. Clique no botão abaixo e garanta o projeto hoje."</w:t>
       </w:r>
     </w:p>
     <w:p>
@@ -1794,7 +2159,16 @@
           </w:tcPr>
           <w:p>
             <w:r>
-              <w:t>"Quer deixar de ter peça parada e ter produto que sai? Clica no link e dá uma olhada no projeto."</w:t>
+              <w:t xml:space="preserve">"Quer deixar de ter peça parada e passar a ter um produto que sai? Garanta agora o projeto da </w:t>
+            </w:r>
+            <w:r>
+              <w:rPr>
+                <w:b/>
+              </w:rPr>
+              <w:t>Necessaire Make</w:t>
+            </w:r>
+            <w:r>
+              <w:t>, produza a primeira peça esta semana e coloque na vitrine o que a cliente realmente compra. Clique no botão abaixo."</w:t>
             </w:r>
           </w:p>
         </w:tc>
@@ -1809,7 +2183,7 @@
         <w:t>CTA:</w:t>
       </w:r>
       <w:r>
-        <w:t xml:space="preserve"> "Link na bio."</w:t>
+        <w:t xml:space="preserve"> "Garanta o projeto pelo botão abaixo e troque a peça parada por um produto que vende."</w:t>
       </w:r>
     </w:p>
     <w:p>
@@ -2091,7 +2465,25 @@
           </w:tcPr>
           <w:p>
             <w:r>
-              <w:t>"Claro que cada caso é um caso, resultados variam. Mas a conta fecha. O projeto tá no link se você quiser começar."</w:t>
+              <w:t xml:space="preserve">"Cada caso é um caso e os resultados variam, mas a conta fecha. Se ela fecha para você também, garanta o projeto agora: são </w:t>
+            </w:r>
+            <w:r>
+              <w:rPr>
+                <w:b/>
+              </w:rPr>
+              <w:t>R$ [__]</w:t>
+            </w:r>
+            <w:r>
+              <w:t xml:space="preserve"> de investimento que podem se pagar com </w:t>
+            </w:r>
+            <w:r>
+              <w:rPr>
+                <w:b/>
+              </w:rPr>
+              <w:t>[__] vendas</w:t>
+            </w:r>
+            <w:r>
+              <w:t>. O botão está logo abaixo."</w:t>
             </w:r>
           </w:p>
         </w:tc>
@@ -2360,7 +2752,25 @@
               <w:t>e</w:t>
             </w:r>
             <w:r>
-              <w:t xml:space="preserve"> a apresentar. Clica no link e vê como funciona."</w:t>
+              <w:t xml:space="preserve"> a apresentar a peça para a cliente aceitar o preço de </w:t>
+            </w:r>
+            <w:r>
+              <w:rPr>
+                <w:b/>
+              </w:rPr>
+              <w:t>R$ 130</w:t>
+            </w:r>
+            <w:r>
+              <w:t xml:space="preserve">. Garanta o seu agora, com </w:t>
+            </w:r>
+            <w:r>
+              <w:rPr>
+                <w:b/>
+              </w:rPr>
+              <w:t>[__] dias de garantia</w:t>
+            </w:r>
+            <w:r>
+              <w:t>, e comece a vender peças que as clientes valorizam."</w:t>
             </w:r>
           </w:p>
         </w:tc>
@@ -2621,16 +3031,25 @@
           </w:tcPr>
           <w:p>
             <w:r>
-              <w:t xml:space="preserve">"Se você quer um produto com saída garantida entre as mães, o projeto da </w:t>
+              <w:t xml:space="preserve">"Se você quer um produto com saída garantida entre as mães, garanta agora o projeto da </w:t>
             </w:r>
             <w:r>
               <w:rPr>
                 <w:b/>
               </w:rPr>
-              <w:t>Mimo</w:t>
-            </w:r>
-            <w:r>
-              <w:t xml:space="preserve"> está no link."</w:t>
+              <w:t>Térmica Mimo</w:t>
+            </w:r>
+            <w:r>
+              <w:t xml:space="preserve">. Você aprende a fazer e começa a vender por </w:t>
+            </w:r>
+            <w:r>
+              <w:rPr>
+                <w:b/>
+              </w:rPr>
+              <w:t>R$ 145</w:t>
+            </w:r>
+            <w:r>
+              <w:t>. Clique no botão abaixo e comece hoje."</w:t>
             </w:r>
           </w:p>
         </w:tc>
@@ -2836,7 +3255,16 @@
           </w:tcPr>
           <w:p>
             <w:r>
-              <w:t>"Quem faz e vende essa peça tem saída o ano todo. O projeto completo tá no link."</w:t>
+              <w:t xml:space="preserve">"Quem faz e vende essa peça tem saída o ano todo. Garanta agora o projeto completo da </w:t>
+            </w:r>
+            <w:r>
+              <w:rPr>
+                <w:b/>
+              </w:rPr>
+              <w:t>Mimo</w:t>
+            </w:r>
+            <w:r>
+              <w:t xml:space="preserve"> e comece a produzir para o próximo chá de bebê. Clique no botão abaixo."</w:t>
             </w:r>
           </w:p>
         </w:tc>
@@ -3186,7 +3614,7 @@
           </w:tcPr>
           <w:p>
             <w:r>
-              <w:t xml:space="preserve">"Claro, </w:t>
+              <w:t xml:space="preserve">"Os </w:t>
             </w:r>
             <w:r>
               <w:rPr>
@@ -3195,7 +3623,7 @@
               <w:t>resultados variam</w:t>
             </w:r>
             <w:r>
-              <w:t>. Mas se a conta fecha pra você, vale olhar. Link na descrição."</w:t>
+              <w:t>, mas se a conta fecha para você, o momento é agora: garanta o projeto antes do fim de ano e chegue ao Natal com produto pronto e caixa. Clique no botão abaixo."</w:t>
             </w:r>
           </w:p>
         </w:tc>
@@ -3419,7 +3847,7 @@
           </w:tcPr>
           <w:p>
             <w:r>
-              <w:t>"Quer ver como o projeto te ajuda a ter esse tipo de peça? Clica no link."</w:t>
+              <w:t>"Quer ter peças de margem alta no seu ateliê? Garanta o projeto agora, faça a conta com o seu custo real e comece a lucrar já nas primeiras vendas. Clique no botão abaixo."</w:t>
             </w:r>
           </w:p>
         </w:tc>
@@ -3698,7 +4126,16 @@
           </w:tcPr>
           <w:p>
             <w:r>
-              <w:t>"O passo a passo de como produzir e vender tá no projeto. Link na bio."</w:t>
+              <w:t xml:space="preserve">"O passo a passo de produção e de venda está no projeto. Garanta o seu agora, faça a primeira peça esta semana e comece a contar as </w:t>
+            </w:r>
+            <w:r>
+              <w:rPr>
+                <w:b/>
+              </w:rPr>
+              <w:t>[8]</w:t>
+            </w:r>
+            <w:r>
+              <w:t xml:space="preserve"> vendas. Clique no botão abaixo."</w:t>
             </w:r>
           </w:p>
         </w:tc>
@@ -3942,7 +4379,7 @@
           </w:tcPr>
           <w:p>
             <w:r>
-              <w:t>"Clica no link e garante o projeto hoje."</w:t>
+              <w:t>"Quem começar agora produz e vende antes do Natal, e quem deixa para dezembro fica sem tempo. Garanta o projeto hoje, no botão abaixo, e comece a produzir esta semana."</w:t>
             </w:r>
           </w:p>
         </w:tc>
@@ -4173,7 +4610,7 @@
           </w:tcPr>
           <w:p>
             <w:r>
-              <w:t>"Começa hoje. Link na descrição."</w:t>
+              <w:t>"Cada dia que passa são peças a menos para o Natal. Garanta o projeto agora e comece a produzir hoje. O botão está logo abaixo."</w:t>
             </w:r>
           </w:p>
         </w:tc>
@@ -4426,7 +4863,25 @@
           </w:tcPr>
           <w:p>
             <w:r>
-              <w:t>"Os dois projetos estão no link. Escolhe por onde começar."</w:t>
+              <w:t xml:space="preserve">"Escolha por onde começar: </w:t>
+            </w:r>
+            <w:r>
+              <w:rPr>
+                <w:b/>
+              </w:rPr>
+              <w:t>Necessaire Make</w:t>
+            </w:r>
+            <w:r>
+              <w:t xml:space="preserve"> ou </w:t>
+            </w:r>
+            <w:r>
+              <w:rPr>
+                <w:b/>
+              </w:rPr>
+              <w:t>Térmica Mimo</w:t>
+            </w:r>
+            <w:r>
+              <w:t>. Garanta os dois projetos e monte o kit de presente antes do Natal, ou comece por um e adicione o outro depois. Clique no botão abaixo."</w:t>
             </w:r>
           </w:p>
         </w:tc>
@@ -4612,7 +5067,25 @@
           </w:tcPr>
           <w:p>
             <w:r>
-              <w:t>"Coloca essas peças na vitrine e veja o que acontece com o giro. O projeto tá no link."</w:t>
+              <w:t xml:space="preserve">"Coloque na vitrine o que gira. Garanta agora o projeto da </w:t>
+            </w:r>
+            <w:r>
+              <w:rPr>
+                <w:b/>
+              </w:rPr>
+              <w:t>Necessaire Make</w:t>
+            </w:r>
+            <w:r>
+              <w:t xml:space="preserve"> e da </w:t>
+            </w:r>
+            <w:r>
+              <w:rPr>
+                <w:b/>
+              </w:rPr>
+              <w:t>Térmica Mimo</w:t>
+            </w:r>
+            <w:r>
+              <w:t xml:space="preserve"> e troque o que está parado por produtos que a cliente procura. Clique no botão abaixo."</w:t>
             </w:r>
           </w:p>
         </w:tc>
@@ -4825,7 +5298,43 @@
           </w:tcPr>
           <w:p>
             <w:r>
-              <w:t>"Começa pequeno, testa, vende. Se funcionar, repete. O link do projeto está aqui embaixo."</w:t>
+              <w:t xml:space="preserve">"Comece pequeno, teste e venda. Com o projeto de </w:t>
+            </w:r>
+            <w:r>
+              <w:rPr>
+                <w:b/>
+              </w:rPr>
+              <w:t>R$ [__]</w:t>
+            </w:r>
+            <w:r>
+              <w:t xml:space="preserve"> e o material de </w:t>
+            </w:r>
+            <w:r>
+              <w:rPr>
+                <w:b/>
+              </w:rPr>
+              <w:t>R$ [__]</w:t>
+            </w:r>
+            <w:r>
+              <w:t xml:space="preserve"> por peça, você recupera o investimento em </w:t>
+            </w:r>
+            <w:r>
+              <w:rPr>
+                <w:b/>
+              </w:rPr>
+              <w:t>[__] vendas</w:t>
+            </w:r>
+            <w:r>
+              <w:t xml:space="preserve"> e ainda tem </w:t>
+            </w:r>
+            <w:r>
+              <w:rPr>
+                <w:b/>
+              </w:rPr>
+              <w:t>[__] dias de garantia</w:t>
+            </w:r>
+            <w:r>
+              <w:t>. Garanta o seu agora, no botão abaixo."</w:t>
             </w:r>
           </w:p>
         </w:tc>
@@ -5038,7 +5547,16 @@
           </w:tcPr>
           <w:p>
             <w:r>
-              <w:t>"Se o seu ateliê também quer um produto novo, clica no link."</w:t>
+              <w:t xml:space="preserve">"Se o seu ateliê precisa de um produto novo para o fim de ano, garanta agora o projeto da </w:t>
+            </w:r>
+            <w:r>
+              <w:rPr>
+                <w:b/>
+              </w:rPr>
+              <w:t>Necessaire Make</w:t>
+            </w:r>
+            <w:r>
+              <w:t xml:space="preserve"> e coloque na vitrine antes do Natal. Clique no botão abaixo."</w:t>
             </w:r>
           </w:p>
         </w:tc>
@@ -5289,7 +5807,16 @@
           </w:tcPr>
           <w:p>
             <w:r>
-              <w:t>"Sem risco. Volta no link e entra hoje."</w:t>
+              <w:t xml:space="preserve">"Sem risco: são </w:t>
+            </w:r>
+            <w:r>
+              <w:rPr>
+                <w:b/>
+              </w:rPr>
+              <w:t>[__] dias de garantia</w:t>
+            </w:r>
+            <w:r>
+              <w:t>. Se não fizer sentido para você, o seu dinheiro volta. Clique no botão abaixo e entre hoje, antes que o prazo para produzir para o Natal acabe."</w:t>
             </w:r>
           </w:p>
         </w:tc>
@@ -5471,7 +5998,16 @@
           </w:tcPr>
           <w:p>
             <w:r>
-              <w:t>"Se a conta fechou pra você, é hoje. O link está logo abaixo."</w:t>
+              <w:t xml:space="preserve">"Se a conta fechou para você, o momento é hoje. Garanta o projeto agora no botão abaixo: depois de </w:t>
+            </w:r>
+            <w:r>
+              <w:rPr>
+                <w:b/>
+              </w:rPr>
+              <w:t>[data]</w:t>
+            </w:r>
+            <w:r>
+              <w:t xml:space="preserve"> não há mais tempo de produzir e vender antes do Natal."</w:t>
             </w:r>
           </w:p>
         </w:tc>
@@ -5690,7 +6226,16 @@
               <w:t>R$ 130</w:t>
             </w:r>
             <w:r>
-              <w:t>? O projeto completo tá no link."</w:t>
+              <w:t xml:space="preserve">? Garanta o projeto completo agora, com </w:t>
+            </w:r>
+            <w:r>
+              <w:rPr>
+                <w:b/>
+              </w:rPr>
+              <w:t>[__] dias de garantia</w:t>
+            </w:r>
+            <w:r>
+              <w:t>, e comece a produzir hoje. Clique no botão abaixo."</w:t>
             </w:r>
           </w:p>
         </w:tc>
@@ -5838,7 +6383,7 @@
         <w:pStyle w:val="IntenseQuote"/>
       </w:pPr>
       <w:r>
-        <w:t>👉 Clique em "Saiba mais" e comece antes do Natal.</w:t>
+        <w:t>👉 Garanta o projeto hoje em "Saiba mais" e chegue ao Natal com produto pronto e caixa.</w:t>
       </w:r>
     </w:p>
     <w:p>
@@ -5934,7 +6479,16 @@
         <w:pStyle w:val="IntenseQuote"/>
       </w:pPr>
       <w:r>
-        <w:t>👉 Saiba mais no botão abaixo.</w:t>
+        <w:t xml:space="preserve">👉 Garanta o projeto da Necessaire Make por </w:t>
+      </w:r>
+      <w:r>
+        <w:rPr>
+          <w:b/>
+        </w:rPr>
+        <w:t>R$ [__]</w:t>
+      </w:r>
+      <w:r>
+        <w:t xml:space="preserve"> no botão abaixo e comece a produzir hoje.</w:t>
       </w:r>
     </w:p>
     <w:p>
@@ -6036,7 +6590,7 @@
         <w:pStyle w:val="IntenseQuote"/>
       </w:pPr>
       <w:r>
-        <w:t xml:space="preserve">👉 Clique em "Saiba mais" e veja como funciona. </w:t>
+        <w:t xml:space="preserve">👉 Garanta o seu projeto em "Saiba mais" e comece a sua primeira venda ainda este mês. </w:t>
       </w:r>
       <w:r>
         <w:rPr>
@@ -6135,7 +6689,7 @@
         <w:pStyle w:val="IntenseQuote"/>
       </w:pPr>
       <w:r>
-        <w:t>Faça a conta e veja se o projeto se paga. 👇</w:t>
+        <w:t>Faça a conta e garanta o projeto agora no botão abaixo. 👇</w:t>
       </w:r>
     </w:p>
     <w:p>
@@ -6191,7 +6745,7 @@
         <w:pStyle w:val="IntenseQuote"/>
       </w:pPr>
       <w:r>
-        <w:t>Escolha o projeto e comece a produzir agora.</w:t>
+        <w:t>Garanta os dois projetos no botão abaixo e monte o kit de presente antes do Natal.</w:t>
       </w:r>
     </w:p>
     <w:p>
@@ -6285,7 +6839,7 @@
         <w:pStyle w:val="ListBullet"/>
       </w:pPr>
       <w:r>
-        <w:t>"Passo a passo completo. Comece hoje."</w:t>
+        <w:t>"Garanta o projeto hoje e comece a produzir."</w:t>
       </w:r>
     </w:p>
     <w:p>
@@ -6293,7 +6847,7 @@
         <w:pStyle w:val="ListBullet"/>
       </w:pPr>
       <w:r>
-        <w:t>"Produza e venda antes do Natal."</w:t>
+        <w:t>"Produza e venda antes do Natal. Garanta o seu."</w:t>
       </w:r>
     </w:p>
     <w:p>
@@ -6301,7 +6855,7 @@
         <w:pStyle w:val="ListBullet"/>
       </w:pPr>
       <w:r>
-        <w:t>"Projeto pensado para vender."</w:t>
+        <w:t>"Projeto pensado para vender. Compre agora."</w:t>
       </w:r>
     </w:p>
     <w:p>
@@ -6356,7 +6910,7 @@
         <w:t>(Depois de responder:)</w:t>
       </w:r>
       <w:r>
-        <w:t xml:space="preserve"> Então vai gostar. A necessaire vende por </w:t>
+        <w:t xml:space="preserve"> Então você vai gostar. A necessaire vende por </w:t>
       </w:r>
       <w:r>
         <w:rPr>
@@ -6365,7 +6919,25 @@
         <w:t>R$ 130</w:t>
       </w:r>
       <w:r>
-        <w:t xml:space="preserve"> e o projeto te ensina a fazer e a vender. Quer que eu te mande o link?</w:t>
+        <w:t xml:space="preserve"> e o projeto te ensina a fazer e a vender. Hoje ele está por </w:t>
+      </w:r>
+      <w:r>
+        <w:rPr>
+          <w:b/>
+        </w:rPr>
+        <w:t>R$ [__]</w:t>
+      </w:r>
+      <w:r>
+        <w:t xml:space="preserve">, com </w:t>
+      </w:r>
+      <w:r>
+        <w:rPr>
+          <w:b/>
+        </w:rPr>
+        <w:t>[__] dias de garantia</w:t>
+      </w:r>
+      <w:r>
+        <w:t>. Posso te enviar o link para garantir agora?</w:t>
       </w:r>
     </w:p>
     <w:p>
@@ -6390,7 +6962,7 @@
         <w:t>[5]</w:t>
       </w:r>
       <w:r>
-        <w:t xml:space="preserve"> no primeiro mês. Posso te ajudar a escolher por onde começar?</w:t>
+        <w:t xml:space="preserve"> no primeiro mês. Posso te enviar o link para você garantir o seu hoje?</w:t>
       </w:r>
     </w:p>
     <w:p>
@@ -6406,7 +6978,25 @@
         <w:pStyle w:val="IntenseQuote"/>
       </w:pPr>
       <w:r>
-        <w:t>[Nome], o prazo pra produzir antes do Natal está acabando. Se ainda quer garantir, o link está aqui: [link]. Qualquer dúvida é só chamar. 🎄</w:t>
+        <w:t xml:space="preserve">[Nome], o prazo para produzir antes do Natal acaba em </w:t>
+      </w:r>
+      <w:r>
+        <w:rPr>
+          <w:b/>
+        </w:rPr>
+        <w:t>[data]</w:t>
+      </w:r>
+      <w:r>
+        <w:t xml:space="preserve">. Garanta o projeto agora: [link]. Você tem </w:t>
+      </w:r>
+      <w:r>
+        <w:rPr>
+          <w:b/>
+        </w:rPr>
+        <w:t>[__] dias de garantia</w:t>
+      </w:r>
+      <w:r>
+        <w:t>. Se ainda tiver dúvida, me chame que eu respondo agora. 🎄</w:t>
       </w:r>
     </w:p>
     <w:p>

</xml_diff>